<commit_message>
docs: rebuild v2 as a 5-slide deck and rewrite the report to match
Structure follows the reference deck (goal, system, data and training, risks,
evaluation). Slides use a new white/blue layout with real demo frames and the
four camera views. Training settings updated to 100k steps, batch 8; the
training command builder now accepts --batch-size and --save-freq.

Co-Authored-By: Claude Sonnet 5.5 <noreply@anthropic.com>
</commit_message>
<xml_diff>
--- a/docs/towel_report/v2/report.docx
+++ b/docs/towel_report/v2/report.docx
@@ -24,11 +24,11 @@
       <w:r>
         <w:rPr>
           <w:rFonts w:ascii="맑은 고딕" w:cs="맑은 고딕" w:eastAsia="맑은 고딕" w:hAnsi="맑은 고딕"/>
-          <w:color w:val="6B6F76"/>
+          <w:color w:val="6B7684"/>
           <w:sz w:val="22"/>
           <w:szCs w:val="22"/>
         </w:rPr>
-        <w:t xml:space="preserve">로봇 두 팔이 수건을 반으로 접고 대문접기까지 하는 단일 정책 · SO-101 양팔 로봇 · 2026-09-30 기준</w:t>
+        <w:t xml:space="preserve">로봇 두 팔이 펼친 수건을 반으로 접고 대문접기까지 하는 단일 정책 · SO-101 양팔 로봇 · 2026-09-30 기준</w:t>
       </w:r>
     </w:p>
     <w:p>
@@ -44,7 +44,7 @@
           <w:sz w:val="30"/>
           <w:szCs w:val="30"/>
         </w:rPr>
-        <w:t xml:space="preserve">1. 한눈에 보기</w:t>
+        <w:t xml:space="preserve">요약</w:t>
       </w:r>
     </w:p>
     <w:p>
@@ -72,7 +72,7 @@
           <w:sz w:val="22"/>
           <w:szCs w:val="22"/>
         </w:rPr>
-        <w:t xml:space="preserve">로봇 두 팔이 펼쳐진 수건을 스스로 반으로 접고, 이어서 양쪽을 안으로 접어 대문접기까지 마무리하게 만든다.</w:t>
+        <w:t xml:space="preserve">로봇 두 팔이 펼친 수건을 스스로 반으로 접고, 이어서 양쪽을 안으로 접어 대문접기까지 마무리하게 만든다.</w:t>
       </w:r>
     </w:p>
     <w:p>
@@ -100,7 +100,7 @@
           <w:sz w:val="22"/>
           <w:szCs w:val="22"/>
         </w:rPr>
-        <w:t xml:space="preserve">사람이 로봇 팔을 직접 조작한 시연 46개(복제 포함 97개, 약 16만 프레임)를 보고 따라 하는 AI 모델(ACT)을 학습한다. 반접기부터 대문접기까지 끊지 않고 이어서 배운다.</w:t>
+        <w:t xml:space="preserve">사람이 직접 조작한 시연을 보고 따라 하는 ACT 모델 하나로 두 동작을 끊지 않고 이어서 학습한다.</w:t>
       </w:r>
     </w:p>
     <w:p>
@@ -128,7 +128,7 @@
           <w:sz w:val="22"/>
           <w:szCs w:val="22"/>
         </w:rPr>
-        <w:t xml:space="preserve">학습 준비 단계이다. 시연 데이터를 학습용으로 정리하고 있으며, 끝나면 모델을 약 3시간 학습한다.</w:t>
+        <w:t xml:space="preserve">시연 데이터를 학습용으로 정리하는 단계이고, 끝나면 100,000스텝(배치 8) 학습을 약 11~13시간 진행한다.</w:t>
       </w:r>
     </w:p>
     <w:p>
@@ -172,7 +172,7 @@
           <w:sz w:val="30"/>
           <w:szCs w:val="30"/>
         </w:rPr>
-        <w:t xml:space="preserve">2. 무엇을 만드는가</w:t>
+        <w:t xml:space="preserve">1. 프로젝트 목표</w:t>
       </w:r>
     </w:p>
     <w:p>
@@ -198,7 +198,7 @@
           <wp:inline distT="0" distB="0" distL="0" distR="0">
             <wp:extent cx="5715000" cy="1076325"/>
             <wp:effectExtent t="0" r="0" b="0" l="0"/>
-            <wp:docPr id="1" name="strip" descr="펼친 수건, 반으로 접기, 양쪽을 안으로 접는 중, 대문접기 완성" title="시연 영상 4장면"/>
+            <wp:docPr id="1" name="시연 영상 4장면" descr="시연 영상 4장면" title="시연 영상 4장면"/>
             <wp:cNvGraphicFramePr>
               <a:graphicFrameLocks xmlns:a="http://schemas.openxmlformats.org/drawingml/2006/main" noChangeAspect="1"/>
             </wp:cNvGraphicFramePr>
@@ -242,7 +242,7 @@
       <w:r>
         <w:rPr>
           <w:rFonts w:ascii="맑은 고딕" w:cs="맑은 고딕" w:eastAsia="맑은 고딕" w:hAnsi="맑은 고딕"/>
-          <w:color w:val="6B6F76"/>
+          <w:color w:val="6B7684"/>
           <w:sz w:val="19"/>
           <w:szCs w:val="19"/>
         </w:rPr>
@@ -332,7 +332,81 @@
           <w:sz w:val="30"/>
           <w:szCs w:val="30"/>
         </w:rPr>
-        <w:t xml:space="preserve">3. 무엇으로 가르치는가 (데이터)</w:t>
+        <w:t xml:space="preserve">2. 시스템 구성</w:t>
+      </w:r>
+    </w:p>
+    <w:p>
+      <w:pPr>
+        <w:spacing w:after="120" w:line="320"/>
+      </w:pPr>
+      <w:r>
+        <w:rPr>
+          <w:rFonts w:ascii="맑은 고딕" w:cs="맑은 고딕" w:eastAsia="맑은 고딕" w:hAnsi="맑은 고딕"/>
+          <w:sz w:val="22"/>
+          <w:szCs w:val="22"/>
+        </w:rPr>
+        <w:t xml:space="preserve">카메라 4대의 영상과 양팔 관절 상태가 ACT 모델 하나로 들어가, 양팔 관절 목표값이 나온다. 아래 화면은 실제 데이터의 한 시점이다.</w:t>
+      </w:r>
+    </w:p>
+    <w:p>
+      <w:pPr>
+        <w:spacing w:after="60"/>
+        <w:jc w:val="center"/>
+      </w:pPr>
+      <w:r>
+        <w:drawing>
+          <wp:inline distT="0" distB="0" distL="0" distR="0">
+            <wp:extent cx="5715000" cy="1057275"/>
+            <wp:effectExtent t="0" r="0" b="0" l="0"/>
+            <wp:docPr id="2" name="카메라 4대 화면" descr="카메라 4대 화면" title="카메라 4대 화면"/>
+            <wp:cNvGraphicFramePr>
+              <a:graphicFrameLocks xmlns:a="http://schemas.openxmlformats.org/drawingml/2006/main" noChangeAspect="1"/>
+            </wp:cNvGraphicFramePr>
+            <a:graphic xmlns:a="http://schemas.openxmlformats.org/drawingml/2006/main">
+              <a:graphicData uri="http://schemas.openxmlformats.org/drawingml/2006/picture">
+                <pic:pic xmlns:pic="http://schemas.openxmlformats.org/drawingml/2006/picture">
+                  <pic:nvPicPr>
+                    <pic:cNvPr id="0" name="" descr=""/>
+                    <pic:cNvPicPr>
+                      <a:picLocks noChangeAspect="1" noChangeArrowheads="1"/>
+                    </pic:cNvPicPr>
+                  </pic:nvPicPr>
+                  <pic:blipFill>
+                    <a:blip r:embed="rId8" cstate="none"/>
+                    <a:srcRect/>
+                    <a:stretch>
+                      <a:fillRect/>
+                    </a:stretch>
+                  </pic:blipFill>
+                  <pic:spPr bwMode="auto">
+                    <a:xfrm>
+                      <a:off x="0" y="0"/>
+                      <a:ext cx="5715000" cy="1057275"/>
+                    </a:xfrm>
+                    <a:prstGeom prst="rect">
+                      <a:avLst/>
+                    </a:prstGeom>
+                  </pic:spPr>
+                </pic:pic>
+              </a:graphicData>
+            </a:graphic>
+          </wp:inline>
+        </w:drawing>
+      </w:r>
+    </w:p>
+    <w:p>
+      <w:pPr>
+        <w:spacing w:after="160"/>
+        <w:jc w:val="center"/>
+      </w:pPr>
+      <w:r>
+        <w:rPr>
+          <w:rFonts w:ascii="맑은 고딕" w:cs="맑은 고딕" w:eastAsia="맑은 고딕" w:hAnsi="맑은 고딕"/>
+          <w:color w:val="6B7684"/>
+          <w:sz w:val="19"/>
+          <w:szCs w:val="19"/>
+        </w:rPr>
+        <w:t xml:space="preserve">위에서 본 화면 · 깊이 화면 · 왼쪽 손목 카메라 · 오른쪽 손목 카메라</w:t>
       </w:r>
     </w:p>
     <w:tbl>
@@ -348,9 +422,8 @@
         </w:tblBorders>
       </w:tblPr>
       <w:tblGrid>
-        <w:gridCol w:w="2000"/>
-        <w:gridCol w:w="1700"/>
-        <w:gridCol w:w="5326"/>
+        <w:gridCol w:w="1500"/>
+        <w:gridCol w:w="7526"/>
       </w:tblGrid>
       <w:tr>
         <w:trPr>
@@ -358,7 +431,7 @@
         </w:trPr>
         <w:tc>
           <w:tcPr>
-            <w:tcW w:type="dxa" w:w="2000"/>
+            <w:tcW w:type="dxa" w:w="1500"/>
             <w:tcBorders>
               <w:top w:val="single" w:color="BDB8AA" w:sz="4"/>
               <w:left w:val="single" w:color="BDB8AA" w:sz="4"/>
@@ -382,13 +455,13 @@
                 <w:sz w:val="20"/>
                 <w:szCs w:val="20"/>
               </w:rPr>
-              <w:t xml:space="preserve">단계</w:t>
-            </w:r>
-          </w:p>
-        </w:tc>
-        <w:tc>
-          <w:tcPr>
-            <w:tcW w:type="dxa" w:w="1700"/>
+              <w:t xml:space="preserve">구분</w:t>
+            </w:r>
+          </w:p>
+        </w:tc>
+        <w:tc>
+          <w:tcPr>
+            <w:tcW w:type="dxa" w:w="7526"/>
             <w:tcBorders>
               <w:top w:val="single" w:color="BDB8AA" w:sz="4"/>
               <w:left w:val="single" w:color="BDB8AA" w:sz="4"/>
@@ -412,13 +485,305 @@
                 <w:sz w:val="20"/>
                 <w:szCs w:val="20"/>
               </w:rPr>
-              <w:t xml:space="preserve">개수</w:t>
-            </w:r>
-          </w:p>
-        </w:tc>
-        <w:tc>
-          <w:tcPr>
-            <w:tcW w:type="dxa" w:w="5326"/>
+              <w:t xml:space="preserve">내용</w:t>
+            </w:r>
+          </w:p>
+        </w:tc>
+      </w:tr>
+      <w:tr>
+        <w:tc>
+          <w:tcPr>
+            <w:tcW w:type="dxa" w:w="1500"/>
+            <w:tcBorders>
+              <w:top w:val="single" w:color="BDB8AA" w:sz="4"/>
+              <w:left w:val="single" w:color="BDB8AA" w:sz="4"/>
+              <w:bottom w:val="single" w:color="BDB8AA" w:sz="4"/>
+              <w:right w:val="single" w:color="BDB8AA" w:sz="4"/>
+            </w:tcBorders>
+            <w:tcMar>
+              <w:top w:type="dxa" w:w="70"/>
+              <w:left w:type="dxa" w:w="110"/>
+              <w:bottom w:type="dxa" w:w="70"/>
+              <w:right w:type="dxa" w:w="110"/>
+            </w:tcMar>
+          </w:tcPr>
+          <w:p>
+            <w:r>
+              <w:rPr>
+                <w:rFonts w:ascii="맑은 고딕" w:cs="맑은 고딕" w:eastAsia="맑은 고딕" w:hAnsi="맑은 고딕"/>
+                <w:b w:val="false"/>
+                <w:bCs w:val="false"/>
+                <w:sz w:val="20"/>
+                <w:szCs w:val="20"/>
+              </w:rPr>
+              <w:t xml:space="preserve">입력</w:t>
+            </w:r>
+          </w:p>
+        </w:tc>
+        <w:tc>
+          <w:tcPr>
+            <w:tcW w:type="dxa" w:w="7526"/>
+            <w:tcBorders>
+              <w:top w:val="single" w:color="BDB8AA" w:sz="4"/>
+              <w:left w:val="single" w:color="BDB8AA" w:sz="4"/>
+              <w:bottom w:val="single" w:color="BDB8AA" w:sz="4"/>
+              <w:right w:val="single" w:color="BDB8AA" w:sz="4"/>
+            </w:tcBorders>
+            <w:tcMar>
+              <w:top w:type="dxa" w:w="70"/>
+              <w:left w:type="dxa" w:w="110"/>
+              <w:bottom w:type="dxa" w:w="70"/>
+              <w:right w:type="dxa" w:w="110"/>
+            </w:tcMar>
+          </w:tcPr>
+          <w:p>
+            <w:r>
+              <w:rPr>
+                <w:rFonts w:ascii="맑은 고딕" w:cs="맑은 고딕" w:eastAsia="맑은 고딕" w:hAnsi="맑은 고딕"/>
+                <w:b w:val="false"/>
+                <w:bCs w:val="false"/>
+                <w:sz w:val="20"/>
+                <w:szCs w:val="20"/>
+              </w:rPr>
+              <w:t xml:space="preserve">카메라 4대(위에서 본 화면, 깊이 화면, 왼쪽·오른쪽 손목) 영상과 양팔 관절 상태 12개, 초당 30프레임</w:t>
+            </w:r>
+          </w:p>
+        </w:tc>
+      </w:tr>
+      <w:tr>
+        <w:tc>
+          <w:tcPr>
+            <w:tcW w:type="dxa" w:w="1500"/>
+            <w:tcBorders>
+              <w:top w:val="single" w:color="BDB8AA" w:sz="4"/>
+              <w:left w:val="single" w:color="BDB8AA" w:sz="4"/>
+              <w:bottom w:val="single" w:color="BDB8AA" w:sz="4"/>
+              <w:right w:val="single" w:color="BDB8AA" w:sz="4"/>
+            </w:tcBorders>
+            <w:tcMar>
+              <w:top w:type="dxa" w:w="70"/>
+              <w:left w:type="dxa" w:w="110"/>
+              <w:bottom w:type="dxa" w:w="70"/>
+              <w:right w:type="dxa" w:w="110"/>
+            </w:tcMar>
+          </w:tcPr>
+          <w:p>
+            <w:r>
+              <w:rPr>
+                <w:rFonts w:ascii="맑은 고딕" w:cs="맑은 고딕" w:eastAsia="맑은 고딕" w:hAnsi="맑은 고딕"/>
+                <w:b w:val="false"/>
+                <w:bCs w:val="false"/>
+                <w:sz w:val="20"/>
+                <w:szCs w:val="20"/>
+              </w:rPr>
+              <w:t xml:space="preserve">모델</w:t>
+            </w:r>
+          </w:p>
+        </w:tc>
+        <w:tc>
+          <w:tcPr>
+            <w:tcW w:type="dxa" w:w="7526"/>
+            <w:tcBorders>
+              <w:top w:val="single" w:color="BDB8AA" w:sz="4"/>
+              <w:left w:val="single" w:color="BDB8AA" w:sz="4"/>
+              <w:bottom w:val="single" w:color="BDB8AA" w:sz="4"/>
+              <w:right w:val="single" w:color="BDB8AA" w:sz="4"/>
+            </w:tcBorders>
+            <w:tcMar>
+              <w:top w:type="dxa" w:w="70"/>
+              <w:left w:type="dxa" w:w="110"/>
+              <w:bottom w:type="dxa" w:w="70"/>
+              <w:right w:type="dxa" w:w="110"/>
+            </w:tcMar>
+          </w:tcPr>
+          <w:p>
+            <w:r>
+              <w:rPr>
+                <w:rFonts w:ascii="맑은 고딕" w:cs="맑은 고딕" w:eastAsia="맑은 고딕" w:hAnsi="맑은 고딕"/>
+                <w:b w:val="false"/>
+                <w:bCs w:val="false"/>
+                <w:sz w:val="20"/>
+                <w:szCs w:val="20"/>
+              </w:rPr>
+              <w:t xml:space="preserve">ACT. 사람의 시연을 따라 하도록 학습하며, 100스텝(약 3.3초) 분량의 동작을 한 번에 예측 (chunk_size 100, VAE 사용, dim_model 512)</w:t>
+            </w:r>
+          </w:p>
+        </w:tc>
+      </w:tr>
+      <w:tr>
+        <w:tc>
+          <w:tcPr>
+            <w:tcW w:type="dxa" w:w="1500"/>
+            <w:tcBorders>
+              <w:top w:val="single" w:color="BDB8AA" w:sz="4"/>
+              <w:left w:val="single" w:color="BDB8AA" w:sz="4"/>
+              <w:bottom w:val="single" w:color="BDB8AA" w:sz="4"/>
+              <w:right w:val="single" w:color="BDB8AA" w:sz="4"/>
+            </w:tcBorders>
+            <w:tcMar>
+              <w:top w:type="dxa" w:w="70"/>
+              <w:left w:type="dxa" w:w="110"/>
+              <w:bottom w:type="dxa" w:w="70"/>
+              <w:right w:type="dxa" w:w="110"/>
+            </w:tcMar>
+          </w:tcPr>
+          <w:p>
+            <w:r>
+              <w:rPr>
+                <w:rFonts w:ascii="맑은 고딕" w:cs="맑은 고딕" w:eastAsia="맑은 고딕" w:hAnsi="맑은 고딕"/>
+                <w:b w:val="false"/>
+                <w:bCs w:val="false"/>
+                <w:sz w:val="20"/>
+                <w:szCs w:val="20"/>
+              </w:rPr>
+              <w:t xml:space="preserve">출력</w:t>
+            </w:r>
+          </w:p>
+        </w:tc>
+        <w:tc>
+          <w:tcPr>
+            <w:tcW w:type="dxa" w:w="7526"/>
+            <w:tcBorders>
+              <w:top w:val="single" w:color="BDB8AA" w:sz="4"/>
+              <w:left w:val="single" w:color="BDB8AA" w:sz="4"/>
+              <w:bottom w:val="single" w:color="BDB8AA" w:sz="4"/>
+              <w:right w:val="single" w:color="BDB8AA" w:sz="4"/>
+            </w:tcBorders>
+            <w:tcMar>
+              <w:top w:type="dxa" w:w="70"/>
+              <w:left w:type="dxa" w:w="110"/>
+              <w:bottom w:type="dxa" w:w="70"/>
+              <w:right w:type="dxa" w:w="110"/>
+            </w:tcMar>
+          </w:tcPr>
+          <w:p>
+            <w:r>
+              <w:rPr>
+                <w:rFonts w:ascii="맑은 고딕" w:cs="맑은 고딕" w:eastAsia="맑은 고딕" w:hAnsi="맑은 고딕"/>
+                <w:b w:val="false"/>
+                <w:bCs w:val="false"/>
+                <w:sz w:val="20"/>
+                <w:szCs w:val="20"/>
+              </w:rPr>
+              <w:t xml:space="preserve">양팔 관절 목표값 12개. 예측한 동작을 초당 30번 실행</w:t>
+            </w:r>
+          </w:p>
+        </w:tc>
+      </w:tr>
+      <w:tr>
+        <w:tc>
+          <w:tcPr>
+            <w:tcW w:type="dxa" w:w="1500"/>
+            <w:tcBorders>
+              <w:top w:val="single" w:color="BDB8AA" w:sz="4"/>
+              <w:left w:val="single" w:color="BDB8AA" w:sz="4"/>
+              <w:bottom w:val="single" w:color="BDB8AA" w:sz="4"/>
+              <w:right w:val="single" w:color="BDB8AA" w:sz="4"/>
+            </w:tcBorders>
+            <w:tcMar>
+              <w:top w:type="dxa" w:w="70"/>
+              <w:left w:type="dxa" w:w="110"/>
+              <w:bottom w:type="dxa" w:w="70"/>
+              <w:right w:type="dxa" w:w="110"/>
+            </w:tcMar>
+          </w:tcPr>
+          <w:p>
+            <w:r>
+              <w:rPr>
+                <w:rFonts w:ascii="맑은 고딕" w:cs="맑은 고딕" w:eastAsia="맑은 고딕" w:hAnsi="맑은 고딕"/>
+                <w:b w:val="false"/>
+                <w:bCs w:val="false"/>
+                <w:sz w:val="20"/>
+                <w:szCs w:val="20"/>
+              </w:rPr>
+              <w:t xml:space="preserve">의미</w:t>
+            </w:r>
+          </w:p>
+        </w:tc>
+        <w:tc>
+          <w:tcPr>
+            <w:tcW w:type="dxa" w:w="7526"/>
+            <w:tcBorders>
+              <w:top w:val="single" w:color="BDB8AA" w:sz="4"/>
+              <w:left w:val="single" w:color="BDB8AA" w:sz="4"/>
+              <w:bottom w:val="single" w:color="BDB8AA" w:sz="4"/>
+              <w:right w:val="single" w:color="BDB8AA" w:sz="4"/>
+            </w:tcBorders>
+            <w:tcMar>
+              <w:top w:type="dxa" w:w="70"/>
+              <w:left w:type="dxa" w:w="110"/>
+              <w:bottom w:type="dxa" w:w="70"/>
+              <w:right w:type="dxa" w:w="110"/>
+            </w:tcMar>
+          </w:tcPr>
+          <w:p>
+            <w:r>
+              <w:rPr>
+                <w:rFonts w:ascii="맑은 고딕" w:cs="맑은 고딕" w:eastAsia="맑은 고딕" w:hAnsi="맑은 고딕"/>
+                <w:b w:val="false"/>
+                <w:bCs w:val="false"/>
+                <w:sz w:val="20"/>
+                <w:szCs w:val="20"/>
+              </w:rPr>
+              <w:t xml:space="preserve">반접기와 대문접기를 하나의 모델이 이어서 처리한다</w:t>
+            </w:r>
+          </w:p>
+        </w:tc>
+      </w:tr>
+    </w:tbl>
+    <w:p>
+      <w:pPr>
+        <w:spacing w:after="60"/>
+      </w:pPr>
+      <w:r>
+        <w:rPr>
+          <w:rFonts w:ascii="맑은 고딕" w:cs="맑은 고딕" w:eastAsia="맑은 고딕" w:hAnsi="맑은 고딕"/>
+          <w:sz w:val="22"/>
+          <w:szCs w:val="22"/>
+        </w:rPr>
+        <w:t xml:space="preserve"/>
+      </w:r>
+    </w:p>
+    <w:p>
+      <w:pPr>
+        <w:pStyle w:val="Heading1"/>
+        <w:spacing w:after="140" w:before="320"/>
+      </w:pPr>
+      <w:r>
+        <w:rPr>
+          <w:rFonts w:ascii="맑은 고딕" w:cs="맑은 고딕" w:eastAsia="맑은 고딕" w:hAnsi="맑은 고딕"/>
+          <w:b/>
+          <w:bCs/>
+          <w:sz w:val="30"/>
+          <w:szCs w:val="30"/>
+        </w:rPr>
+        <w:t xml:space="preserve">3. 데이터와 학습</w:t>
+      </w:r>
+    </w:p>
+    <w:tbl>
+      <w:tblPr>
+        <w:tblW w:type="dxa" w:w="9026"/>
+        <w:tblBorders>
+          <w:top w:val="single" w:color="auto" w:sz="4"/>
+          <w:left w:val="single" w:color="auto" w:sz="4"/>
+          <w:bottom w:val="single" w:color="auto" w:sz="4"/>
+          <w:right w:val="single" w:color="auto" w:sz="4"/>
+          <w:insideH w:val="single" w:color="auto" w:sz="4"/>
+          <w:insideV w:val="single" w:color="auto" w:sz="4"/>
+        </w:tblBorders>
+      </w:tblPr>
+      <w:tblGrid>
+        <w:gridCol w:w="2600"/>
+        <w:gridCol w:w="1900"/>
+        <w:gridCol w:w="4526"/>
+      </w:tblGrid>
+      <w:tr>
+        <w:trPr>
+          <w:tblHeader/>
+        </w:trPr>
+        <w:tc>
+          <w:tcPr>
+            <w:tcW w:type="dxa" w:w="2600"/>
             <w:tcBorders>
               <w:top w:val="single" w:color="BDB8AA" w:sz="4"/>
               <w:left w:val="single" w:color="BDB8AA" w:sz="4"/>
@@ -442,6 +807,66 @@
                 <w:sz w:val="20"/>
                 <w:szCs w:val="20"/>
               </w:rPr>
+              <w:t xml:space="preserve">단계</w:t>
+            </w:r>
+          </w:p>
+        </w:tc>
+        <w:tc>
+          <w:tcPr>
+            <w:tcW w:type="dxa" w:w="1900"/>
+            <w:tcBorders>
+              <w:top w:val="single" w:color="BDB8AA" w:sz="4"/>
+              <w:left w:val="single" w:color="BDB8AA" w:sz="4"/>
+              <w:bottom w:val="single" w:color="BDB8AA" w:sz="4"/>
+              <w:right w:val="single" w:color="BDB8AA" w:sz="4"/>
+            </w:tcBorders>
+            <w:shd w:fill="ECE9E0" w:color="auto" w:val="clear"/>
+            <w:tcMar>
+              <w:top w:type="dxa" w:w="70"/>
+              <w:left w:type="dxa" w:w="110"/>
+              <w:bottom w:type="dxa" w:w="70"/>
+              <w:right w:type="dxa" w:w="110"/>
+            </w:tcMar>
+          </w:tcPr>
+          <w:p>
+            <w:r>
+              <w:rPr>
+                <w:rFonts w:ascii="맑은 고딕" w:cs="맑은 고딕" w:eastAsia="맑은 고딕" w:hAnsi="맑은 고딕"/>
+                <w:b/>
+                <w:bCs/>
+                <w:sz w:val="20"/>
+                <w:szCs w:val="20"/>
+              </w:rPr>
+              <w:t xml:space="preserve">개수</w:t>
+            </w:r>
+          </w:p>
+        </w:tc>
+        <w:tc>
+          <w:tcPr>
+            <w:tcW w:type="dxa" w:w="4526"/>
+            <w:tcBorders>
+              <w:top w:val="single" w:color="BDB8AA" w:sz="4"/>
+              <w:left w:val="single" w:color="BDB8AA" w:sz="4"/>
+              <w:bottom w:val="single" w:color="BDB8AA" w:sz="4"/>
+              <w:right w:val="single" w:color="BDB8AA" w:sz="4"/>
+            </w:tcBorders>
+            <w:shd w:fill="ECE9E0" w:color="auto" w:val="clear"/>
+            <w:tcMar>
+              <w:top w:type="dxa" w:w="70"/>
+              <w:left w:type="dxa" w:w="110"/>
+              <w:bottom w:type="dxa" w:w="70"/>
+              <w:right w:type="dxa" w:w="110"/>
+            </w:tcMar>
+          </w:tcPr>
+          <w:p>
+            <w:r>
+              <w:rPr>
+                <w:rFonts w:ascii="맑은 고딕" w:cs="맑은 고딕" w:eastAsia="맑은 고딕" w:hAnsi="맑은 고딕"/>
+                <w:b/>
+                <w:bCs/>
+                <w:sz w:val="20"/>
+                <w:szCs w:val="20"/>
+              </w:rPr>
               <w:t xml:space="preserve">설명</w:t>
             </w:r>
           </w:p>
@@ -450,7 +875,7 @@
       <w:tr>
         <w:tc>
           <w:tcPr>
-            <w:tcW w:type="dxa" w:w="2000"/>
+            <w:tcW w:type="dxa" w:w="2600"/>
             <w:tcBorders>
               <w:top w:val="single" w:color="BDB8AA" w:sz="4"/>
               <w:left w:val="single" w:color="BDB8AA" w:sz="4"/>
@@ -479,7 +904,7 @@
         </w:tc>
         <w:tc>
           <w:tcPr>
-            <w:tcW w:type="dxa" w:w="1700"/>
+            <w:tcW w:type="dxa" w:w="1900"/>
             <w:tcBorders>
               <w:top w:val="single" w:color="BDB8AA" w:sz="4"/>
               <w:left w:val="single" w:color="BDB8AA" w:sz="4"/>
@@ -508,7 +933,7 @@
         </w:tc>
         <w:tc>
           <w:tcPr>
-            <w:tcW w:type="dxa" w:w="5326"/>
+            <w:tcW w:type="dxa" w:w="4526"/>
             <w:tcBorders>
               <w:top w:val="single" w:color="BDB8AA" w:sz="4"/>
               <w:left w:val="single" w:color="BDB8AA" w:sz="4"/>
@@ -539,7 +964,7 @@
       <w:tr>
         <w:tc>
           <w:tcPr>
-            <w:tcW w:type="dxa" w:w="2000"/>
+            <w:tcW w:type="dxa" w:w="2600"/>
             <w:tcBorders>
               <w:top w:val="single" w:color="BDB8AA" w:sz="4"/>
               <w:left w:val="single" w:color="BDB8AA" w:sz="4"/>
@@ -568,7 +993,7 @@
         </w:tc>
         <w:tc>
           <w:tcPr>
-            <w:tcW w:type="dxa" w:w="1700"/>
+            <w:tcW w:type="dxa" w:w="1900"/>
             <w:tcBorders>
               <w:top w:val="single" w:color="BDB8AA" w:sz="4"/>
               <w:left w:val="single" w:color="BDB8AA" w:sz="4"/>
@@ -597,30 +1022,30 @@
         </w:tc>
         <w:tc>
           <w:tcPr>
-            <w:tcW w:type="dxa" w:w="5326"/>
-            <w:tcBorders>
-              <w:top w:val="single" w:color="BDB8AA" w:sz="4"/>
-              <w:left w:val="single" w:color="BDB8AA" w:sz="4"/>
-              <w:bottom w:val="single" w:color="BDB8AA" w:sz="4"/>
-              <w:right w:val="single" w:color="BDB8AA" w:sz="4"/>
-            </w:tcBorders>
-            <w:tcMar>
-              <w:top w:type="dxa" w:w="70"/>
-              <w:left w:type="dxa" w:w="110"/>
-              <w:bottom w:type="dxa" w:w="70"/>
-              <w:right w:type="dxa" w:w="110"/>
-            </w:tcMar>
-          </w:tcPr>
-          <w:p>
-            <w:r>
-              <w:rPr>
-                <w:rFonts w:ascii="맑은 고딕" w:cs="맑은 고딕" w:eastAsia="맑은 고딕" w:hAnsi="맑은 고딕"/>
-                <w:b w:val="false"/>
-                <w:bCs w:val="false"/>
-                <w:sz w:val="20"/>
-                <w:szCs w:val="20"/>
-              </w:rPr>
-              <w:t xml:space="preserve">반접기와 대문접기를 모두 담고, 수건이 깨끗이 펼쳐진 상태에서 시작</w:t>
+            <w:tcW w:type="dxa" w:w="4526"/>
+            <w:tcBorders>
+              <w:top w:val="single" w:color="BDB8AA" w:sz="4"/>
+              <w:left w:val="single" w:color="BDB8AA" w:sz="4"/>
+              <w:bottom w:val="single" w:color="BDB8AA" w:sz="4"/>
+              <w:right w:val="single" w:color="BDB8AA" w:sz="4"/>
+            </w:tcBorders>
+            <w:tcMar>
+              <w:top w:type="dxa" w:w="70"/>
+              <w:left w:type="dxa" w:w="110"/>
+              <w:bottom w:type="dxa" w:w="70"/>
+              <w:right w:type="dxa" w:w="110"/>
+            </w:tcMar>
+          </w:tcPr>
+          <w:p>
+            <w:r>
+              <w:rPr>
+                <w:rFonts w:ascii="맑은 고딕" w:cs="맑은 고딕" w:eastAsia="맑은 고딕" w:hAnsi="맑은 고딕"/>
+                <w:b w:val="false"/>
+                <w:bCs w:val="false"/>
+                <w:sz w:val="20"/>
+                <w:szCs w:val="20"/>
+              </w:rPr>
+              <w:t xml:space="preserve">반접기와 대문접기를 모두 담고 펼친 상태에서 시작</w:t>
             </w:r>
           </w:p>
         </w:tc>
@@ -628,88 +1053,88 @@
       <w:tr>
         <w:tc>
           <w:tcPr>
-            <w:tcW w:type="dxa" w:w="2000"/>
-            <w:tcBorders>
-              <w:top w:val="single" w:color="BDB8AA" w:sz="4"/>
-              <w:left w:val="single" w:color="BDB8AA" w:sz="4"/>
-              <w:bottom w:val="single" w:color="BDB8AA" w:sz="4"/>
-              <w:right w:val="single" w:color="BDB8AA" w:sz="4"/>
-            </w:tcBorders>
-            <w:tcMar>
-              <w:top w:type="dxa" w:w="70"/>
-              <w:left w:type="dxa" w:w="110"/>
-              <w:bottom w:type="dxa" w:w="70"/>
-              <w:right w:type="dxa" w:w="110"/>
-            </w:tcMar>
-          </w:tcPr>
-          <w:p>
-            <w:r>
-              <w:rPr>
-                <w:rFonts w:ascii="맑은 고딕" w:cs="맑은 고딕" w:eastAsia="맑은 고딕" w:hAnsi="맑은 고딕"/>
-                <w:b w:val="false"/>
-                <w:bCs w:val="false"/>
-                <w:sz w:val="20"/>
-                <w:szCs w:val="20"/>
-              </w:rPr>
-              <w:t xml:space="preserve">복제 포함</w:t>
-            </w:r>
-          </w:p>
-        </w:tc>
-        <w:tc>
-          <w:tcPr>
-            <w:tcW w:type="dxa" w:w="1700"/>
-            <w:tcBorders>
-              <w:top w:val="single" w:color="BDB8AA" w:sz="4"/>
-              <w:left w:val="single" w:color="BDB8AA" w:sz="4"/>
-              <w:bottom w:val="single" w:color="BDB8AA" w:sz="4"/>
-              <w:right w:val="single" w:color="BDB8AA" w:sz="4"/>
-            </w:tcBorders>
-            <w:tcMar>
-              <w:top w:type="dxa" w:w="70"/>
-              <w:left w:type="dxa" w:w="110"/>
-              <w:bottom w:type="dxa" w:w="70"/>
-              <w:right w:type="dxa" w:w="110"/>
-            </w:tcMar>
-          </w:tcPr>
-          <w:p>
-            <w:r>
-              <w:rPr>
-                <w:rFonts w:ascii="맑은 고딕" w:cs="맑은 고딕" w:eastAsia="맑은 고딕" w:hAnsi="맑은 고딕"/>
-                <w:b w:val="false"/>
-                <w:bCs w:val="false"/>
-                <w:sz w:val="20"/>
-                <w:szCs w:val="20"/>
-              </w:rPr>
-              <w:t xml:space="preserve">97개 / 159,084프레임</w:t>
-            </w:r>
-          </w:p>
-        </w:tc>
-        <w:tc>
-          <w:tcPr>
-            <w:tcW w:type="dxa" w:w="5326"/>
-            <w:tcBorders>
-              <w:top w:val="single" w:color="BDB8AA" w:sz="4"/>
-              <w:left w:val="single" w:color="BDB8AA" w:sz="4"/>
-              <w:bottom w:val="single" w:color="BDB8AA" w:sz="4"/>
-              <w:right w:val="single" w:color="BDB8AA" w:sz="4"/>
-            </w:tcBorders>
-            <w:tcMar>
-              <w:top w:type="dxa" w:w="70"/>
-              <w:left w:type="dxa" w:w="110"/>
-              <w:bottom w:type="dxa" w:w="70"/>
-              <w:right w:type="dxa" w:w="110"/>
-            </w:tcMar>
-          </w:tcPr>
-          <w:p>
-            <w:r>
-              <w:rPr>
-                <w:rFonts w:ascii="맑은 고딕" w:cs="맑은 고딕" w:eastAsia="맑은 고딕" w:hAnsi="맑은 고딕"/>
-                <w:b w:val="false"/>
-                <w:bCs w:val="false"/>
-                <w:sz w:val="20"/>
-                <w:szCs w:val="20"/>
-              </w:rPr>
-              <w:t xml:space="preserve">조건별로 균형 있게 복제해 늘림</w:t>
+            <w:tcW w:type="dxa" w:w="2600"/>
+            <w:tcBorders>
+              <w:top w:val="single" w:color="BDB8AA" w:sz="4"/>
+              <w:left w:val="single" w:color="BDB8AA" w:sz="4"/>
+              <w:bottom w:val="single" w:color="BDB8AA" w:sz="4"/>
+              <w:right w:val="single" w:color="BDB8AA" w:sz="4"/>
+            </w:tcBorders>
+            <w:tcMar>
+              <w:top w:type="dxa" w:w="70"/>
+              <w:left w:type="dxa" w:w="110"/>
+              <w:bottom w:type="dxa" w:w="70"/>
+              <w:right w:type="dxa" w:w="110"/>
+            </w:tcMar>
+          </w:tcPr>
+          <w:p>
+            <w:r>
+              <w:rPr>
+                <w:rFonts w:ascii="맑은 고딕" w:cs="맑은 고딕" w:eastAsia="맑은 고딕" w:hAnsi="맑은 고딕"/>
+                <w:b w:val="false"/>
+                <w:bCs w:val="false"/>
+                <w:sz w:val="20"/>
+                <w:szCs w:val="20"/>
+              </w:rPr>
+              <w:t xml:space="preserve">복제 포함 에피소드</w:t>
+            </w:r>
+          </w:p>
+        </w:tc>
+        <w:tc>
+          <w:tcPr>
+            <w:tcW w:type="dxa" w:w="1900"/>
+            <w:tcBorders>
+              <w:top w:val="single" w:color="BDB8AA" w:sz="4"/>
+              <w:left w:val="single" w:color="BDB8AA" w:sz="4"/>
+              <w:bottom w:val="single" w:color="BDB8AA" w:sz="4"/>
+              <w:right w:val="single" w:color="BDB8AA" w:sz="4"/>
+            </w:tcBorders>
+            <w:tcMar>
+              <w:top w:type="dxa" w:w="70"/>
+              <w:left w:type="dxa" w:w="110"/>
+              <w:bottom w:type="dxa" w:w="70"/>
+              <w:right w:type="dxa" w:w="110"/>
+            </w:tcMar>
+          </w:tcPr>
+          <w:p>
+            <w:r>
+              <w:rPr>
+                <w:rFonts w:ascii="맑은 고딕" w:cs="맑은 고딕" w:eastAsia="맑은 고딕" w:hAnsi="맑은 고딕"/>
+                <w:b w:val="false"/>
+                <w:bCs w:val="false"/>
+                <w:sz w:val="20"/>
+                <w:szCs w:val="20"/>
+              </w:rPr>
+              <w:t xml:space="preserve">97개</w:t>
+            </w:r>
+          </w:p>
+        </w:tc>
+        <w:tc>
+          <w:tcPr>
+            <w:tcW w:type="dxa" w:w="4526"/>
+            <w:tcBorders>
+              <w:top w:val="single" w:color="BDB8AA" w:sz="4"/>
+              <w:left w:val="single" w:color="BDB8AA" w:sz="4"/>
+              <w:bottom w:val="single" w:color="BDB8AA" w:sz="4"/>
+              <w:right w:val="single" w:color="BDB8AA" w:sz="4"/>
+            </w:tcBorders>
+            <w:tcMar>
+              <w:top w:type="dxa" w:w="70"/>
+              <w:left w:type="dxa" w:w="110"/>
+              <w:bottom w:type="dxa" w:w="70"/>
+              <w:right w:type="dxa" w:w="110"/>
+            </w:tcMar>
+          </w:tcPr>
+          <w:p>
+            <w:r>
+              <w:rPr>
+                <w:rFonts w:ascii="맑은 고딕" w:cs="맑은 고딕" w:eastAsia="맑은 고딕" w:hAnsi="맑은 고딕"/>
+                <w:b w:val="false"/>
+                <w:bCs w:val="false"/>
+                <w:sz w:val="20"/>
+                <w:szCs w:val="20"/>
+              </w:rPr>
+              <w:t xml:space="preserve">조건별로 균형 있게 복제 (원본당 2~3번)</w:t>
             </w:r>
           </w:p>
         </w:tc>
@@ -717,7 +1142,96 @@
       <w:tr>
         <w:tc>
           <w:tcPr>
-            <w:tcW w:type="dxa" w:w="2000"/>
+            <w:tcW w:type="dxa" w:w="2600"/>
+            <w:tcBorders>
+              <w:top w:val="single" w:color="BDB8AA" w:sz="4"/>
+              <w:left w:val="single" w:color="BDB8AA" w:sz="4"/>
+              <w:bottom w:val="single" w:color="BDB8AA" w:sz="4"/>
+              <w:right w:val="single" w:color="BDB8AA" w:sz="4"/>
+            </w:tcBorders>
+            <w:tcMar>
+              <w:top w:type="dxa" w:w="70"/>
+              <w:left w:type="dxa" w:w="110"/>
+              <w:bottom w:type="dxa" w:w="70"/>
+              <w:right w:type="dxa" w:w="110"/>
+            </w:tcMar>
+          </w:tcPr>
+          <w:p>
+            <w:r>
+              <w:rPr>
+                <w:rFonts w:ascii="맑은 고딕" w:cs="맑은 고딕" w:eastAsia="맑은 고딕" w:hAnsi="맑은 고딕"/>
+                <w:b w:val="false"/>
+                <w:bCs w:val="false"/>
+                <w:sz w:val="20"/>
+                <w:szCs w:val="20"/>
+              </w:rPr>
+              <w:t xml:space="preserve">프레임</w:t>
+            </w:r>
+          </w:p>
+        </w:tc>
+        <w:tc>
+          <w:tcPr>
+            <w:tcW w:type="dxa" w:w="1900"/>
+            <w:tcBorders>
+              <w:top w:val="single" w:color="BDB8AA" w:sz="4"/>
+              <w:left w:val="single" w:color="BDB8AA" w:sz="4"/>
+              <w:bottom w:val="single" w:color="BDB8AA" w:sz="4"/>
+              <w:right w:val="single" w:color="BDB8AA" w:sz="4"/>
+            </w:tcBorders>
+            <w:tcMar>
+              <w:top w:type="dxa" w:w="70"/>
+              <w:left w:type="dxa" w:w="110"/>
+              <w:bottom w:type="dxa" w:w="70"/>
+              <w:right w:type="dxa" w:w="110"/>
+            </w:tcMar>
+          </w:tcPr>
+          <w:p>
+            <w:r>
+              <w:rPr>
+                <w:rFonts w:ascii="맑은 고딕" w:cs="맑은 고딕" w:eastAsia="맑은 고딕" w:hAnsi="맑은 고딕"/>
+                <w:b w:val="false"/>
+                <w:bCs w:val="false"/>
+                <w:sz w:val="20"/>
+                <w:szCs w:val="20"/>
+              </w:rPr>
+              <w:t xml:space="preserve">159,084</w:t>
+            </w:r>
+          </w:p>
+        </w:tc>
+        <w:tc>
+          <w:tcPr>
+            <w:tcW w:type="dxa" w:w="4526"/>
+            <w:tcBorders>
+              <w:top w:val="single" w:color="BDB8AA" w:sz="4"/>
+              <w:left w:val="single" w:color="BDB8AA" w:sz="4"/>
+              <w:bottom w:val="single" w:color="BDB8AA" w:sz="4"/>
+              <w:right w:val="single" w:color="BDB8AA" w:sz="4"/>
+            </w:tcBorders>
+            <w:tcMar>
+              <w:top w:type="dxa" w:w="70"/>
+              <w:left w:type="dxa" w:w="110"/>
+              <w:bottom w:type="dxa" w:w="70"/>
+              <w:right w:type="dxa" w:w="110"/>
+            </w:tcMar>
+          </w:tcPr>
+          <w:p>
+            <w:r>
+              <w:rPr>
+                <w:rFonts w:ascii="맑은 고딕" w:cs="맑은 고딕" w:eastAsia="맑은 고딕" w:hAnsi="맑은 고딕"/>
+                <w:b w:val="false"/>
+                <w:bCs w:val="false"/>
+                <w:sz w:val="20"/>
+                <w:szCs w:val="20"/>
+              </w:rPr>
+              <w:t xml:space="preserve">학습 127,514 / 평가 31,570</w:t>
+            </w:r>
+          </w:p>
+        </w:tc>
+      </w:tr>
+      <w:tr>
+        <w:tc>
+          <w:tcPr>
+            <w:tcW w:type="dxa" w:w="2600"/>
             <w:tcBorders>
               <w:top w:val="single" w:color="BDB8AA" w:sz="4"/>
               <w:left w:val="single" w:color="BDB8AA" w:sz="4"/>
@@ -746,7 +1260,7 @@
         </w:tc>
         <w:tc>
           <w:tcPr>
-            <w:tcW w:type="dxa" w:w="1700"/>
+            <w:tcW w:type="dxa" w:w="1900"/>
             <w:tcBorders>
               <w:top w:val="single" w:color="BDB8AA" w:sz="4"/>
               <w:left w:val="single" w:color="BDB8AA" w:sz="4"/>
@@ -775,30 +1289,30 @@
         </w:tc>
         <w:tc>
           <w:tcPr>
-            <w:tcW w:type="dxa" w:w="5326"/>
-            <w:tcBorders>
-              <w:top w:val="single" w:color="BDB8AA" w:sz="4"/>
-              <w:left w:val="single" w:color="BDB8AA" w:sz="4"/>
-              <w:bottom w:val="single" w:color="BDB8AA" w:sz="4"/>
-              <w:right w:val="single" w:color="BDB8AA" w:sz="4"/>
-            </w:tcBorders>
-            <w:tcMar>
-              <w:top w:type="dxa" w:w="70"/>
-              <w:left w:type="dxa" w:w="110"/>
-              <w:bottom w:type="dxa" w:w="70"/>
-              <w:right w:type="dxa" w:w="110"/>
-            </w:tcMar>
-          </w:tcPr>
-          <w:p>
-            <w:r>
-              <w:rPr>
-                <w:rFonts w:ascii="맑은 고딕" w:cs="맑은 고딕" w:eastAsia="맑은 고딕" w:hAnsi="맑은 고딕"/>
-                <w:b w:val="false"/>
-                <w:bCs w:val="false"/>
-                <w:sz w:val="20"/>
-                <w:szCs w:val="20"/>
-              </w:rPr>
-              <w:t xml:space="preserve">원본 시연 단위로 나눠, 복제된 같은 영상이 양쪽에 섞이지 않음</w:t>
+            <w:tcW w:type="dxa" w:w="4526"/>
+            <w:tcBorders>
+              <w:top w:val="single" w:color="BDB8AA" w:sz="4"/>
+              <w:left w:val="single" w:color="BDB8AA" w:sz="4"/>
+              <w:bottom w:val="single" w:color="BDB8AA" w:sz="4"/>
+              <w:right w:val="single" w:color="BDB8AA" w:sz="4"/>
+            </w:tcBorders>
+            <w:tcMar>
+              <w:top w:type="dxa" w:w="70"/>
+              <w:left w:type="dxa" w:w="110"/>
+              <w:bottom w:type="dxa" w:w="70"/>
+              <w:right w:type="dxa" w:w="110"/>
+            </w:tcMar>
+          </w:tcPr>
+          <w:p>
+            <w:r>
+              <w:rPr>
+                <w:rFonts w:ascii="맑은 고딕" w:cs="맑은 고딕" w:eastAsia="맑은 고딕" w:hAnsi="맑은 고딕"/>
+                <w:b w:val="false"/>
+                <w:bCs w:val="false"/>
+                <w:sz w:val="20"/>
+                <w:szCs w:val="20"/>
+              </w:rPr>
+              <w:t xml:space="preserve">원본 시연 단위로 분리 (학습 원본 37개, 평가 원본 9개, 겹침 없음)</w:t>
             </w:r>
           </w:p>
         </w:tc>
@@ -834,7 +1348,7 @@
           <w:sz w:val="22"/>
           <w:szCs w:val="22"/>
         </w:rPr>
-        <w:t xml:space="preserve">설계의 핵심: </w:t>
+        <w:t xml:space="preserve">복제본은 같은 영상이다. </w:t>
       </w:r>
       <w:r>
         <w:rPr>
@@ -842,7 +1356,7 @@
           <w:sz w:val="22"/>
           <w:szCs w:val="22"/>
         </w:rPr>
-        <w:t xml:space="preserve">한 시연을 반접기 시작 프레임부터 대문접기 끝 프레임까지 끊지 않고 하나로 이어 잘랐다. 모델이 두 동작 사이의 전환(반으로 접은 수건을 이어서 접는 방법)까지 익힌다.</w:t>
+        <w:t xml:space="preserve">그래서 학습에 쓰이는 서로 다른 시연은 37개이다. 매번 밝기·대비·채도·색조, 선명도, 작은 이동(±3%)과 회전(±3도)을 다르게 바꿔 넣어 과적합을 줄이며, 좌우 반전은 쓰지 않는다.</w:t>
       </w:r>
     </w:p>
     <w:p>
@@ -862,7 +1376,7 @@
           <w:sz w:val="22"/>
           <w:szCs w:val="22"/>
         </w:rPr>
-        <w:t xml:space="preserve">제외한 것: </w:t>
+        <w:t xml:space="preserve">설계의 핵심: </w:t>
       </w:r>
       <w:r>
         <w:rPr>
@@ -870,36 +1384,7 @@
           <w:sz w:val="22"/>
           <w:szCs w:val="22"/>
         </w:rPr>
-        <w:t xml:space="preserve">방향을 다시 잡아야 하는 시연 25개와 그 외 1개는 뺐다.</w:t>
-      </w:r>
-    </w:p>
-    <w:p>
-      <w:pPr>
-        <w:pStyle w:val="Heading1"/>
-        <w:spacing w:after="140" w:before="320"/>
-      </w:pPr>
-      <w:r>
-        <w:rPr>
-          <w:rFonts w:ascii="맑은 고딕" w:cs="맑은 고딕" w:eastAsia="맑은 고딕" w:hAnsi="맑은 고딕"/>
-          <w:b/>
-          <w:bCs/>
-          <w:sz w:val="30"/>
-          <w:szCs w:val="30"/>
-        </w:rPr>
-        <w:t xml:space="preserve">4. 학습 방법</w:t>
-      </w:r>
-    </w:p>
-    <w:p>
-      <w:pPr>
-        <w:spacing w:after="120" w:line="320"/>
-      </w:pPr>
-      <w:r>
-        <w:rPr>
-          <w:rFonts w:ascii="맑은 고딕" w:cs="맑은 고딕" w:eastAsia="맑은 고딕" w:hAnsi="맑은 고딕"/>
-          <w:sz w:val="22"/>
-          <w:szCs w:val="22"/>
-        </w:rPr>
-        <w:t xml:space="preserve">사람의 시연을 따라 하도록 ACT 모델을 학습한다. 기술 설정은 다음과 같다.</w:t>
+        <w:t xml:space="preserve">한 시연을 반접기 시작 프레임부터 대문접기 끝 프레임까지 끊지 않고 하나로 이어 잘랐다. 모델이 두 동작 사이의 전환까지 익힌다. 펼치는 동작은 데이터에 없다.</w:t>
       </w:r>
     </w:p>
     <w:tbl>
@@ -948,7 +1433,7 @@
                 <w:sz w:val="20"/>
                 <w:szCs w:val="20"/>
               </w:rPr>
-              <w:t xml:space="preserve">항목</w:t>
+              <w:t xml:space="preserve">학습 설정</w:t>
             </w:r>
           </w:p>
         </w:tc>
@@ -1009,7 +1494,7 @@
                 <w:sz w:val="20"/>
                 <w:szCs w:val="20"/>
               </w:rPr>
-              <w:t xml:space="preserve">모델</w:t>
+              <w:t xml:space="preserve">학습량</w:t>
             </w:r>
           </w:p>
         </w:tc>
@@ -1038,7 +1523,7 @@
                 <w:sz w:val="20"/>
                 <w:szCs w:val="20"/>
               </w:rPr>
-              <w:t xml:space="preserve">ACT (chunk_size 100, n_action_steps 100, VAE 사용, dim_model 512)</w:t>
+              <w:t xml:space="preserve">100,000스텝, 배치 8 (데이터를 약 6.3바퀴)</w:t>
             </w:r>
           </w:p>
         </w:tc>
@@ -1069,7 +1554,7 @@
                 <w:sz w:val="20"/>
                 <w:szCs w:val="20"/>
               </w:rPr>
-              <w:t xml:space="preserve">학습량</w:t>
+              <w:t xml:space="preserve">점검</w:t>
             </w:r>
           </w:p>
         </w:tc>
@@ -1098,7 +1583,7 @@
                 <w:sz w:val="20"/>
                 <w:szCs w:val="20"/>
               </w:rPr>
-              <w:t xml:space="preserve">40,000스텝, 배치 4 (데이터를 약 1.2바퀴)</w:t>
+              <w:t xml:space="preserve">10,000스텝마다 평가와 체크포인트 저장. 평가 손실이 다시 오르면 이전 체크포인트 사용</w:t>
             </w:r>
           </w:p>
         </w:tc>
@@ -1129,7 +1614,7 @@
                 <w:sz w:val="20"/>
                 <w:szCs w:val="20"/>
               </w:rPr>
-              <w:t xml:space="preserve">점검</w:t>
+              <w:t xml:space="preserve">환경</w:t>
             </w:r>
           </w:p>
         </w:tc>
@@ -1158,7 +1643,7 @@
                 <w:sz w:val="20"/>
                 <w:szCs w:val="20"/>
               </w:rPr>
-              <w:t xml:space="preserve">10,000스텝마다 평가, 5,000스텝마다 저장. 평가 손실이 다시 오르면 이전 체크포인트 사용</w:t>
+              <w:t xml:space="preserve">8GB GPU 노트북. 다른 GPU 작업이 끝나 여유 메모리가 생기면 자동으로 시작</w:t>
             </w:r>
           </w:p>
         </w:tc>
@@ -1189,7 +1674,7 @@
                 <w:sz w:val="20"/>
                 <w:szCs w:val="20"/>
               </w:rPr>
-              <w:t xml:space="preserve">이미지 증강</w:t>
+              <w:t xml:space="preserve">예상 시간</w:t>
             </w:r>
           </w:p>
         </w:tc>
@@ -1218,67 +1703,7 @@
                 <w:sz w:val="20"/>
                 <w:szCs w:val="20"/>
               </w:rPr>
-              <w:t xml:space="preserve">밝기·대비·채도·색조, 작은 이동·회전 (좌우 반전 없음)</w:t>
-            </w:r>
-          </w:p>
-        </w:tc>
-      </w:tr>
-      <w:tr>
-        <w:tc>
-          <w:tcPr>
-            <w:tcW w:type="dxa" w:w="2600"/>
-            <w:tcBorders>
-              <w:top w:val="single" w:color="BDB8AA" w:sz="4"/>
-              <w:left w:val="single" w:color="BDB8AA" w:sz="4"/>
-              <w:bottom w:val="single" w:color="BDB8AA" w:sz="4"/>
-              <w:right w:val="single" w:color="BDB8AA" w:sz="4"/>
-            </w:tcBorders>
-            <w:tcMar>
-              <w:top w:type="dxa" w:w="70"/>
-              <w:left w:type="dxa" w:w="110"/>
-              <w:bottom w:type="dxa" w:w="70"/>
-              <w:right w:type="dxa" w:w="110"/>
-            </w:tcMar>
-          </w:tcPr>
-          <w:p>
-            <w:r>
-              <w:rPr>
-                <w:rFonts w:ascii="맑은 고딕" w:cs="맑은 고딕" w:eastAsia="맑은 고딕" w:hAnsi="맑은 고딕"/>
-                <w:b w:val="false"/>
-                <w:bCs w:val="false"/>
-                <w:sz w:val="20"/>
-                <w:szCs w:val="20"/>
-              </w:rPr>
-              <w:t xml:space="preserve">환경</w:t>
-            </w:r>
-          </w:p>
-        </w:tc>
-        <w:tc>
-          <w:tcPr>
-            <w:tcW w:type="dxa" w:w="6426"/>
-            <w:tcBorders>
-              <w:top w:val="single" w:color="BDB8AA" w:sz="4"/>
-              <w:left w:val="single" w:color="BDB8AA" w:sz="4"/>
-              <w:bottom w:val="single" w:color="BDB8AA" w:sz="4"/>
-              <w:right w:val="single" w:color="BDB8AA" w:sz="4"/>
-            </w:tcBorders>
-            <w:tcMar>
-              <w:top w:type="dxa" w:w="70"/>
-              <w:left w:type="dxa" w:w="110"/>
-              <w:bottom w:type="dxa" w:w="70"/>
-              <w:right w:type="dxa" w:w="110"/>
-            </w:tcMar>
-          </w:tcPr>
-          <w:p>
-            <w:r>
-              <w:rPr>
-                <w:rFonts w:ascii="맑은 고딕" w:cs="맑은 고딕" w:eastAsia="맑은 고딕" w:hAnsi="맑은 고딕"/>
-                <w:b w:val="false"/>
-                <w:bCs w:val="false"/>
-                <w:sz w:val="20"/>
-                <w:szCs w:val="20"/>
-              </w:rPr>
-              <w:t xml:space="preserve">8GB GPU, 초당 약 4.4스텝, 평가 포함 약 3시간</w:t>
+              <w:t xml:space="preserve">약 11~13시간 (배치 8의 실제 속도는 시작 후 확인)</w:t>
             </w:r>
           </w:p>
         </w:tc>
@@ -1307,7 +1732,7 @@
           <w:sz w:val="22"/>
           <w:szCs w:val="22"/>
         </w:rPr>
-        <w:t xml:space="preserve">40,000스텝은 20,000스텝이 데이터를 0.6바퀴만 도는 점을 보고 정한 값이며 논문 기준값이 아니다.</w:t>
+        <w:t xml:space="preserve">권장 기본값(ACT 문서: 100,000스텝, 배치 8)을 따랐다. 처음 계획했던 40,000스텝, 배치 4는 데이터를 약 1.25바퀴만 도는 양이어서 늘렸다.</w:t>
       </w:r>
     </w:p>
     <w:p>
@@ -1323,7 +1748,7 @@
           <w:sz w:val="30"/>
           <w:szCs w:val="30"/>
         </w:rPr>
-        <w:t xml:space="preserve">5. 현재 상태와 검증 계획</w:t>
+        <w:t xml:space="preserve">4. 예상 리스크와 대응</w:t>
       </w:r>
     </w:p>
     <w:tbl>
@@ -1339,9 +1764,9 @@
         </w:tblBorders>
       </w:tblPr>
       <w:tblGrid>
-        <w:gridCol w:w="1500"/>
-        <w:gridCol w:w="5000"/>
-        <w:gridCol w:w="2526"/>
+        <w:gridCol w:w="2500"/>
+        <w:gridCol w:w="3000"/>
+        <w:gridCol w:w="3526"/>
       </w:tblGrid>
       <w:tr>
         <w:trPr>
@@ -1349,7 +1774,7 @@
         </w:trPr>
         <w:tc>
           <w:tcPr>
-            <w:tcW w:type="dxa" w:w="1500"/>
+            <w:tcW w:type="dxa" w:w="2500"/>
             <w:tcBorders>
               <w:top w:val="single" w:color="BDB8AA" w:sz="4"/>
               <w:left w:val="single" w:color="BDB8AA" w:sz="4"/>
@@ -1373,13 +1798,13 @@
                 <w:sz w:val="20"/>
                 <w:szCs w:val="20"/>
               </w:rPr>
-              <w:t xml:space="preserve">순서</w:t>
-            </w:r>
-          </w:p>
-        </w:tc>
-        <w:tc>
-          <w:tcPr>
-            <w:tcW w:type="dxa" w:w="5000"/>
+              <w:t xml:space="preserve">위험</w:t>
+            </w:r>
+          </w:p>
+        </w:tc>
+        <w:tc>
+          <w:tcPr>
+            <w:tcW w:type="dxa" w:w="3000"/>
             <w:tcBorders>
               <w:top w:val="single" w:color="BDB8AA" w:sz="4"/>
               <w:left w:val="single" w:color="BDB8AA" w:sz="4"/>
@@ -1403,13 +1828,13 @@
                 <w:sz w:val="20"/>
                 <w:szCs w:val="20"/>
               </w:rPr>
-              <w:t xml:space="preserve">내용</w:t>
-            </w:r>
-          </w:p>
-        </w:tc>
-        <w:tc>
-          <w:tcPr>
-            <w:tcW w:type="dxa" w:w="2526"/>
+              <w:t xml:space="preserve">우려</w:t>
+            </w:r>
+          </w:p>
+        </w:tc>
+        <w:tc>
+          <w:tcPr>
+            <w:tcW w:type="dxa" w:w="3526"/>
             <w:tcBorders>
               <w:top w:val="single" w:color="BDB8AA" w:sz="4"/>
               <w:left w:val="single" w:color="BDB8AA" w:sz="4"/>
@@ -1433,7 +1858,7 @@
                 <w:sz w:val="20"/>
                 <w:szCs w:val="20"/>
               </w:rPr>
-              <w:t xml:space="preserve">상태</w:t>
+              <w:t xml:space="preserve">대응</w:t>
             </w:r>
           </w:p>
         </w:tc>
@@ -1441,88 +1866,88 @@
       <w:tr>
         <w:tc>
           <w:tcPr>
-            <w:tcW w:type="dxa" w:w="1500"/>
-            <w:tcBorders>
-              <w:top w:val="single" w:color="BDB8AA" w:sz="4"/>
-              <w:left w:val="single" w:color="BDB8AA" w:sz="4"/>
-              <w:bottom w:val="single" w:color="BDB8AA" w:sz="4"/>
-              <w:right w:val="single" w:color="BDB8AA" w:sz="4"/>
-            </w:tcBorders>
-            <w:tcMar>
-              <w:top w:type="dxa" w:w="70"/>
-              <w:left w:type="dxa" w:w="110"/>
-              <w:bottom w:type="dxa" w:w="70"/>
-              <w:right w:type="dxa" w:w="110"/>
-            </w:tcMar>
-          </w:tcPr>
-          <w:p>
-            <w:r>
-              <w:rPr>
-                <w:rFonts w:ascii="맑은 고딕" w:cs="맑은 고딕" w:eastAsia="맑은 고딕" w:hAnsi="맑은 고딕"/>
-                <w:b w:val="false"/>
-                <w:bCs w:val="false"/>
-                <w:sz w:val="20"/>
-                <w:szCs w:val="20"/>
-              </w:rPr>
-              <w:t xml:space="preserve">1</w:t>
-            </w:r>
-          </w:p>
-        </w:tc>
-        <w:tc>
-          <w:tcPr>
-            <w:tcW w:type="dxa" w:w="5000"/>
-            <w:tcBorders>
-              <w:top w:val="single" w:color="BDB8AA" w:sz="4"/>
-              <w:left w:val="single" w:color="BDB8AA" w:sz="4"/>
-              <w:bottom w:val="single" w:color="BDB8AA" w:sz="4"/>
-              <w:right w:val="single" w:color="BDB8AA" w:sz="4"/>
-            </w:tcBorders>
-            <w:tcMar>
-              <w:top w:type="dxa" w:w="70"/>
-              <w:left w:type="dxa" w:w="110"/>
-              <w:bottom w:type="dxa" w:w="70"/>
-              <w:right w:type="dxa" w:w="110"/>
-            </w:tcMar>
-          </w:tcPr>
-          <w:p>
-            <w:r>
-              <w:rPr>
-                <w:rFonts w:ascii="맑은 고딕" w:cs="맑은 고딕" w:eastAsia="맑은 고딕" w:hAnsi="맑은 고딕"/>
-                <w:b w:val="false"/>
-                <w:bCs w:val="false"/>
-                <w:sz w:val="20"/>
-                <w:szCs w:val="20"/>
-              </w:rPr>
-              <w:t xml:space="preserve">시연 데이터를 학습용으로 정리</w:t>
-            </w:r>
-          </w:p>
-        </w:tc>
-        <w:tc>
-          <w:tcPr>
-            <w:tcW w:type="dxa" w:w="2526"/>
-            <w:tcBorders>
-              <w:top w:val="single" w:color="BDB8AA" w:sz="4"/>
-              <w:left w:val="single" w:color="BDB8AA" w:sz="4"/>
-              <w:bottom w:val="single" w:color="BDB8AA" w:sz="4"/>
-              <w:right w:val="single" w:color="BDB8AA" w:sz="4"/>
-            </w:tcBorders>
-            <w:tcMar>
-              <w:top w:type="dxa" w:w="70"/>
-              <w:left w:type="dxa" w:w="110"/>
-              <w:bottom w:type="dxa" w:w="70"/>
-              <w:right w:type="dxa" w:w="110"/>
-            </w:tcMar>
-          </w:tcPr>
-          <w:p>
-            <w:r>
-              <w:rPr>
-                <w:rFonts w:ascii="맑은 고딕" w:cs="맑은 고딕" w:eastAsia="맑은 고딕" w:hAnsi="맑은 고딕"/>
-                <w:b w:val="false"/>
-                <w:bCs w:val="false"/>
-                <w:sz w:val="20"/>
-                <w:szCs w:val="20"/>
-              </w:rPr>
-              <w:t xml:space="preserve">진행 중</w:t>
+            <w:tcW w:type="dxa" w:w="2500"/>
+            <w:tcBorders>
+              <w:top w:val="single" w:color="BDB8AA" w:sz="4"/>
+              <w:left w:val="single" w:color="BDB8AA" w:sz="4"/>
+              <w:bottom w:val="single" w:color="BDB8AA" w:sz="4"/>
+              <w:right w:val="single" w:color="BDB8AA" w:sz="4"/>
+            </w:tcBorders>
+            <w:tcMar>
+              <w:top w:type="dxa" w:w="70"/>
+              <w:left w:type="dxa" w:w="110"/>
+              <w:bottom w:type="dxa" w:w="70"/>
+              <w:right w:type="dxa" w:w="110"/>
+            </w:tcMar>
+          </w:tcPr>
+          <w:p>
+            <w:r>
+              <w:rPr>
+                <w:rFonts w:ascii="맑은 고딕" w:cs="맑은 고딕" w:eastAsia="맑은 고딕" w:hAnsi="맑은 고딕"/>
+                <w:b w:val="false"/>
+                <w:bCs w:val="false"/>
+                <w:sz w:val="20"/>
+                <w:szCs w:val="20"/>
+              </w:rPr>
+              <w:t xml:space="preserve">시작 상태가 한정됨</w:t>
+            </w:r>
+          </w:p>
+        </w:tc>
+        <w:tc>
+          <w:tcPr>
+            <w:tcW w:type="dxa" w:w="3000"/>
+            <w:tcBorders>
+              <w:top w:val="single" w:color="BDB8AA" w:sz="4"/>
+              <w:left w:val="single" w:color="BDB8AA" w:sz="4"/>
+              <w:bottom w:val="single" w:color="BDB8AA" w:sz="4"/>
+              <w:right w:val="single" w:color="BDB8AA" w:sz="4"/>
+            </w:tcBorders>
+            <w:tcMar>
+              <w:top w:type="dxa" w:w="70"/>
+              <w:left w:type="dxa" w:w="110"/>
+              <w:bottom w:type="dxa" w:w="70"/>
+              <w:right w:type="dxa" w:w="110"/>
+            </w:tcMar>
+          </w:tcPr>
+          <w:p>
+            <w:r>
+              <w:rPr>
+                <w:rFonts w:ascii="맑은 고딕" w:cs="맑은 고딕" w:eastAsia="맑은 고딕" w:hAnsi="맑은 고딕"/>
+                <w:b w:val="false"/>
+                <w:bCs w:val="false"/>
+                <w:sz w:val="20"/>
+                <w:szCs w:val="20"/>
+              </w:rPr>
+              <w:t xml:space="preserve">펼친 수건에서 시작하는 시연만 학습해서, 구겨지거나 비뚤게 놓이면 실패할 수 있다</w:t>
+            </w:r>
+          </w:p>
+        </w:tc>
+        <w:tc>
+          <w:tcPr>
+            <w:tcW w:type="dxa" w:w="3526"/>
+            <w:tcBorders>
+              <w:top w:val="single" w:color="BDB8AA" w:sz="4"/>
+              <w:left w:val="single" w:color="BDB8AA" w:sz="4"/>
+              <w:bottom w:val="single" w:color="BDB8AA" w:sz="4"/>
+              <w:right w:val="single" w:color="BDB8AA" w:sz="4"/>
+            </w:tcBorders>
+            <w:tcMar>
+              <w:top w:type="dxa" w:w="70"/>
+              <w:left w:type="dxa" w:w="110"/>
+              <w:bottom w:type="dxa" w:w="70"/>
+              <w:right w:type="dxa" w:w="110"/>
+            </w:tcMar>
+          </w:tcPr>
+          <w:p>
+            <w:r>
+              <w:rPr>
+                <w:rFonts w:ascii="맑은 고딕" w:cs="맑은 고딕" w:eastAsia="맑은 고딕" w:hAnsi="맑은 고딕"/>
+                <w:b w:val="false"/>
+                <w:bCs w:val="false"/>
+                <w:sz w:val="20"/>
+                <w:szCs w:val="20"/>
+              </w:rPr>
+              <w:t xml:space="preserve">시험 때 수건을 먼저 펼쳐 놓고 시작하고, 필요하면 펼치기 시연을 추가</w:t>
             </w:r>
           </w:p>
         </w:tc>
@@ -1530,88 +1955,88 @@
       <w:tr>
         <w:tc>
           <w:tcPr>
-            <w:tcW w:type="dxa" w:w="1500"/>
-            <w:tcBorders>
-              <w:top w:val="single" w:color="BDB8AA" w:sz="4"/>
-              <w:left w:val="single" w:color="BDB8AA" w:sz="4"/>
-              <w:bottom w:val="single" w:color="BDB8AA" w:sz="4"/>
-              <w:right w:val="single" w:color="BDB8AA" w:sz="4"/>
-            </w:tcBorders>
-            <w:tcMar>
-              <w:top w:type="dxa" w:w="70"/>
-              <w:left w:type="dxa" w:w="110"/>
-              <w:bottom w:type="dxa" w:w="70"/>
-              <w:right w:type="dxa" w:w="110"/>
-            </w:tcMar>
-          </w:tcPr>
-          <w:p>
-            <w:r>
-              <w:rPr>
-                <w:rFonts w:ascii="맑은 고딕" w:cs="맑은 고딕" w:eastAsia="맑은 고딕" w:hAnsi="맑은 고딕"/>
-                <w:b w:val="false"/>
-                <w:bCs w:val="false"/>
-                <w:sz w:val="20"/>
-                <w:szCs w:val="20"/>
-              </w:rPr>
-              <w:t xml:space="preserve">2</w:t>
-            </w:r>
-          </w:p>
-        </w:tc>
-        <w:tc>
-          <w:tcPr>
-            <w:tcW w:type="dxa" w:w="5000"/>
-            <w:tcBorders>
-              <w:top w:val="single" w:color="BDB8AA" w:sz="4"/>
-              <w:left w:val="single" w:color="BDB8AA" w:sz="4"/>
-              <w:bottom w:val="single" w:color="BDB8AA" w:sz="4"/>
-              <w:right w:val="single" w:color="BDB8AA" w:sz="4"/>
-            </w:tcBorders>
-            <w:tcMar>
-              <w:top w:type="dxa" w:w="70"/>
-              <w:left w:type="dxa" w:w="110"/>
-              <w:bottom w:type="dxa" w:w="70"/>
-              <w:right w:type="dxa" w:w="110"/>
-            </w:tcMar>
-          </w:tcPr>
-          <w:p>
-            <w:r>
-              <w:rPr>
-                <w:rFonts w:ascii="맑은 고딕" w:cs="맑은 고딕" w:eastAsia="맑은 고딕" w:hAnsi="맑은 고딕"/>
-                <w:b w:val="false"/>
-                <w:bCs w:val="false"/>
-                <w:sz w:val="20"/>
-                <w:szCs w:val="20"/>
-              </w:rPr>
-              <w:t xml:space="preserve">AI 모델 학습 (중간 점검에서 성능이 떨어지면 이전 상태로 되돌림)</w:t>
-            </w:r>
-          </w:p>
-        </w:tc>
-        <w:tc>
-          <w:tcPr>
-            <w:tcW w:type="dxa" w:w="2526"/>
-            <w:tcBorders>
-              <w:top w:val="single" w:color="BDB8AA" w:sz="4"/>
-              <w:left w:val="single" w:color="BDB8AA" w:sz="4"/>
-              <w:bottom w:val="single" w:color="BDB8AA" w:sz="4"/>
-              <w:right w:val="single" w:color="BDB8AA" w:sz="4"/>
-            </w:tcBorders>
-            <w:tcMar>
-              <w:top w:type="dxa" w:w="70"/>
-              <w:left w:type="dxa" w:w="110"/>
-              <w:bottom w:type="dxa" w:w="70"/>
-              <w:right w:type="dxa" w:w="110"/>
-            </w:tcMar>
-          </w:tcPr>
-          <w:p>
-            <w:r>
-              <w:rPr>
-                <w:rFonts w:ascii="맑은 고딕" w:cs="맑은 고딕" w:eastAsia="맑은 고딕" w:hAnsi="맑은 고딕"/>
-                <w:b w:val="false"/>
-                <w:bCs w:val="false"/>
-                <w:sz w:val="20"/>
-                <w:szCs w:val="20"/>
-              </w:rPr>
-              <w:t xml:space="preserve">다음 (약 3시간)</w:t>
+            <w:tcW w:type="dxa" w:w="2500"/>
+            <w:tcBorders>
+              <w:top w:val="single" w:color="BDB8AA" w:sz="4"/>
+              <w:left w:val="single" w:color="BDB8AA" w:sz="4"/>
+              <w:bottom w:val="single" w:color="BDB8AA" w:sz="4"/>
+              <w:right w:val="single" w:color="BDB8AA" w:sz="4"/>
+            </w:tcBorders>
+            <w:tcMar>
+              <w:top w:type="dxa" w:w="70"/>
+              <w:left w:type="dxa" w:w="110"/>
+              <w:bottom w:type="dxa" w:w="70"/>
+              <w:right w:type="dxa" w:w="110"/>
+            </w:tcMar>
+          </w:tcPr>
+          <w:p>
+            <w:r>
+              <w:rPr>
+                <w:rFonts w:ascii="맑은 고딕" w:cs="맑은 고딕" w:eastAsia="맑은 고딕" w:hAnsi="맑은 고딕"/>
+                <w:b w:val="false"/>
+                <w:bCs w:val="false"/>
+                <w:sz w:val="20"/>
+                <w:szCs w:val="20"/>
+              </w:rPr>
+              <w:t xml:space="preserve">서로 다른 시연이 적음</w:t>
+            </w:r>
+          </w:p>
+        </w:tc>
+        <w:tc>
+          <w:tcPr>
+            <w:tcW w:type="dxa" w:w="3000"/>
+            <w:tcBorders>
+              <w:top w:val="single" w:color="BDB8AA" w:sz="4"/>
+              <w:left w:val="single" w:color="BDB8AA" w:sz="4"/>
+              <w:bottom w:val="single" w:color="BDB8AA" w:sz="4"/>
+              <w:right w:val="single" w:color="BDB8AA" w:sz="4"/>
+            </w:tcBorders>
+            <w:tcMar>
+              <w:top w:type="dxa" w:w="70"/>
+              <w:left w:type="dxa" w:w="110"/>
+              <w:bottom w:type="dxa" w:w="70"/>
+              <w:right w:type="dxa" w:w="110"/>
+            </w:tcMar>
+          </w:tcPr>
+          <w:p>
+            <w:r>
+              <w:rPr>
+                <w:rFonts w:ascii="맑은 고딕" w:cs="맑은 고딕" w:eastAsia="맑은 고딕" w:hAnsi="맑은 고딕"/>
+                <w:b w:val="false"/>
+                <w:bCs w:val="false"/>
+                <w:sz w:val="20"/>
+                <w:szCs w:val="20"/>
+              </w:rPr>
+              <w:t xml:space="preserve">복제본이 같은 영상이라 실제 학습 시연은 37개뿐이다</w:t>
+            </w:r>
+          </w:p>
+        </w:tc>
+        <w:tc>
+          <w:tcPr>
+            <w:tcW w:type="dxa" w:w="3526"/>
+            <w:tcBorders>
+              <w:top w:val="single" w:color="BDB8AA" w:sz="4"/>
+              <w:left w:val="single" w:color="BDB8AA" w:sz="4"/>
+              <w:bottom w:val="single" w:color="BDB8AA" w:sz="4"/>
+              <w:right w:val="single" w:color="BDB8AA" w:sz="4"/>
+            </w:tcBorders>
+            <w:tcMar>
+              <w:top w:type="dxa" w:w="70"/>
+              <w:left w:type="dxa" w:w="110"/>
+              <w:bottom w:type="dxa" w:w="70"/>
+              <w:right w:type="dxa" w:w="110"/>
+            </w:tcMar>
+          </w:tcPr>
+          <w:p>
+            <w:r>
+              <w:rPr>
+                <w:rFonts w:ascii="맑은 고딕" w:cs="맑은 고딕" w:eastAsia="맑은 고딕" w:hAnsi="맑은 고딕"/>
+                <w:b w:val="false"/>
+                <w:bCs w:val="false"/>
+                <w:sz w:val="20"/>
+                <w:szCs w:val="20"/>
+              </w:rPr>
+              <w:t xml:space="preserve">이미지 변환을 매번 다르게 적용하고, 결과를 보고 시연을 더 수집</w:t>
             </w:r>
           </w:p>
         </w:tc>
@@ -1619,88 +2044,88 @@
       <w:tr>
         <w:tc>
           <w:tcPr>
-            <w:tcW w:type="dxa" w:w="1500"/>
-            <w:tcBorders>
-              <w:top w:val="single" w:color="BDB8AA" w:sz="4"/>
-              <w:left w:val="single" w:color="BDB8AA" w:sz="4"/>
-              <w:bottom w:val="single" w:color="BDB8AA" w:sz="4"/>
-              <w:right w:val="single" w:color="BDB8AA" w:sz="4"/>
-            </w:tcBorders>
-            <w:tcMar>
-              <w:top w:type="dxa" w:w="70"/>
-              <w:left w:type="dxa" w:w="110"/>
-              <w:bottom w:type="dxa" w:w="70"/>
-              <w:right w:type="dxa" w:w="110"/>
-            </w:tcMar>
-          </w:tcPr>
-          <w:p>
-            <w:r>
-              <w:rPr>
-                <w:rFonts w:ascii="맑은 고딕" w:cs="맑은 고딕" w:eastAsia="맑은 고딕" w:hAnsi="맑은 고딕"/>
-                <w:b w:val="false"/>
-                <w:bCs w:val="false"/>
-                <w:sz w:val="20"/>
-                <w:szCs w:val="20"/>
-              </w:rPr>
-              <w:t xml:space="preserve">3</w:t>
-            </w:r>
-          </w:p>
-        </w:tc>
-        <w:tc>
-          <w:tcPr>
-            <w:tcW w:type="dxa" w:w="5000"/>
-            <w:tcBorders>
-              <w:top w:val="single" w:color="BDB8AA" w:sz="4"/>
-              <w:left w:val="single" w:color="BDB8AA" w:sz="4"/>
-              <w:bottom w:val="single" w:color="BDB8AA" w:sz="4"/>
-              <w:right w:val="single" w:color="BDB8AA" w:sz="4"/>
-            </w:tcBorders>
-            <w:tcMar>
-              <w:top w:type="dxa" w:w="70"/>
-              <w:left w:type="dxa" w:w="110"/>
-              <w:bottom w:type="dxa" w:w="70"/>
-              <w:right w:type="dxa" w:w="110"/>
-            </w:tcMar>
-          </w:tcPr>
-          <w:p>
-            <w:r>
-              <w:rPr>
-                <w:rFonts w:ascii="맑은 고딕" w:cs="맑은 고딕" w:eastAsia="맑은 고딕" w:hAnsi="맑은 고딕"/>
-                <w:b w:val="false"/>
-                <w:bCs w:val="false"/>
-                <w:sz w:val="20"/>
-                <w:szCs w:val="20"/>
-              </w:rPr>
-              <w:t xml:space="preserve">실제 로봇으로 같은 조건에서 30회 시험</w:t>
-            </w:r>
-          </w:p>
-        </w:tc>
-        <w:tc>
-          <w:tcPr>
-            <w:tcW w:type="dxa" w:w="2526"/>
-            <w:tcBorders>
-              <w:top w:val="single" w:color="BDB8AA" w:sz="4"/>
-              <w:left w:val="single" w:color="BDB8AA" w:sz="4"/>
-              <w:bottom w:val="single" w:color="BDB8AA" w:sz="4"/>
-              <w:right w:val="single" w:color="BDB8AA" w:sz="4"/>
-            </w:tcBorders>
-            <w:tcMar>
-              <w:top w:type="dxa" w:w="70"/>
-              <w:left w:type="dxa" w:w="110"/>
-              <w:bottom w:type="dxa" w:w="70"/>
-              <w:right w:type="dxa" w:w="110"/>
-            </w:tcMar>
-          </w:tcPr>
-          <w:p>
-            <w:r>
-              <w:rPr>
-                <w:rFonts w:ascii="맑은 고딕" w:cs="맑은 고딕" w:eastAsia="맑은 고딕" w:hAnsi="맑은 고딕"/>
-                <w:b w:val="false"/>
-                <w:bCs w:val="false"/>
-                <w:sz w:val="20"/>
-                <w:szCs w:val="20"/>
-              </w:rPr>
-              <w:t xml:space="preserve">그다음</w:t>
+            <w:tcW w:type="dxa" w:w="2500"/>
+            <w:tcBorders>
+              <w:top w:val="single" w:color="BDB8AA" w:sz="4"/>
+              <w:left w:val="single" w:color="BDB8AA" w:sz="4"/>
+              <w:bottom w:val="single" w:color="BDB8AA" w:sz="4"/>
+              <w:right w:val="single" w:color="BDB8AA" w:sz="4"/>
+            </w:tcBorders>
+            <w:tcMar>
+              <w:top w:type="dxa" w:w="70"/>
+              <w:left w:type="dxa" w:w="110"/>
+              <w:bottom w:type="dxa" w:w="70"/>
+              <w:right w:type="dxa" w:w="110"/>
+            </w:tcMar>
+          </w:tcPr>
+          <w:p>
+            <w:r>
+              <w:rPr>
+                <w:rFonts w:ascii="맑은 고딕" w:cs="맑은 고딕" w:eastAsia="맑은 고딕" w:hAnsi="맑은 고딕"/>
+                <w:b w:val="false"/>
+                <w:bCs w:val="false"/>
+                <w:sz w:val="20"/>
+                <w:szCs w:val="20"/>
+              </w:rPr>
+              <w:t xml:space="preserve">오차가 줄어도 성공은 아님</w:t>
+            </w:r>
+          </w:p>
+        </w:tc>
+        <w:tc>
+          <w:tcPr>
+            <w:tcW w:type="dxa" w:w="3000"/>
+            <w:tcBorders>
+              <w:top w:val="single" w:color="BDB8AA" w:sz="4"/>
+              <w:left w:val="single" w:color="BDB8AA" w:sz="4"/>
+              <w:bottom w:val="single" w:color="BDB8AA" w:sz="4"/>
+              <w:right w:val="single" w:color="BDB8AA" w:sz="4"/>
+            </w:tcBorders>
+            <w:tcMar>
+              <w:top w:type="dxa" w:w="70"/>
+              <w:left w:type="dxa" w:w="110"/>
+              <w:bottom w:type="dxa" w:w="70"/>
+              <w:right w:type="dxa" w:w="110"/>
+            </w:tcMar>
+          </w:tcPr>
+          <w:p>
+            <w:r>
+              <w:rPr>
+                <w:rFonts w:ascii="맑은 고딕" w:cs="맑은 고딕" w:eastAsia="맑은 고딕" w:hAnsi="맑은 고딕"/>
+                <w:b w:val="false"/>
+                <w:bCs w:val="false"/>
+                <w:sz w:val="20"/>
+                <w:szCs w:val="20"/>
+              </w:rPr>
+              <w:t xml:space="preserve">학습 손실이 낮아도 로봇이 실제로 잘 접는다는 보장은 없다</w:t>
+            </w:r>
+          </w:p>
+        </w:tc>
+        <w:tc>
+          <w:tcPr>
+            <w:tcW w:type="dxa" w:w="3526"/>
+            <w:tcBorders>
+              <w:top w:val="single" w:color="BDB8AA" w:sz="4"/>
+              <w:left w:val="single" w:color="BDB8AA" w:sz="4"/>
+              <w:bottom w:val="single" w:color="BDB8AA" w:sz="4"/>
+              <w:right w:val="single" w:color="BDB8AA" w:sz="4"/>
+            </w:tcBorders>
+            <w:tcMar>
+              <w:top w:type="dxa" w:w="70"/>
+              <w:left w:type="dxa" w:w="110"/>
+              <w:bottom w:type="dxa" w:w="70"/>
+              <w:right w:type="dxa" w:w="110"/>
+            </w:tcMar>
+          </w:tcPr>
+          <w:p>
+            <w:r>
+              <w:rPr>
+                <w:rFonts w:ascii="맑은 고딕" w:cs="맑은 고딕" w:eastAsia="맑은 고딕" w:hAnsi="맑은 고딕"/>
+                <w:b w:val="false"/>
+                <w:bCs w:val="false"/>
+                <w:sz w:val="20"/>
+                <w:szCs w:val="20"/>
+              </w:rPr>
+              <w:t xml:space="preserve">30회 실제 시험으로 성공률을 측정, 점검에서 성능이 떨어지면 이전 체크포인트 사용</w:t>
             </w:r>
           </w:p>
         </w:tc>
@@ -1708,88 +2133,88 @@
       <w:tr>
         <w:tc>
           <w:tcPr>
-            <w:tcW w:type="dxa" w:w="1500"/>
-            <w:tcBorders>
-              <w:top w:val="single" w:color="BDB8AA" w:sz="4"/>
-              <w:left w:val="single" w:color="BDB8AA" w:sz="4"/>
-              <w:bottom w:val="single" w:color="BDB8AA" w:sz="4"/>
-              <w:right w:val="single" w:color="BDB8AA" w:sz="4"/>
-            </w:tcBorders>
-            <w:tcMar>
-              <w:top w:type="dxa" w:w="70"/>
-              <w:left w:type="dxa" w:w="110"/>
-              <w:bottom w:type="dxa" w:w="70"/>
-              <w:right w:type="dxa" w:w="110"/>
-            </w:tcMar>
-          </w:tcPr>
-          <w:p>
-            <w:r>
-              <w:rPr>
-                <w:rFonts w:ascii="맑은 고딕" w:cs="맑은 고딕" w:eastAsia="맑은 고딕" w:hAnsi="맑은 고딕"/>
-                <w:b w:val="false"/>
-                <w:bCs w:val="false"/>
-                <w:sz w:val="20"/>
-                <w:szCs w:val="20"/>
-              </w:rPr>
-              <w:t xml:space="preserve">4</w:t>
-            </w:r>
-          </w:p>
-        </w:tc>
-        <w:tc>
-          <w:tcPr>
-            <w:tcW w:type="dxa" w:w="5000"/>
-            <w:tcBorders>
-              <w:top w:val="single" w:color="BDB8AA" w:sz="4"/>
-              <w:left w:val="single" w:color="BDB8AA" w:sz="4"/>
-              <w:bottom w:val="single" w:color="BDB8AA" w:sz="4"/>
-              <w:right w:val="single" w:color="BDB8AA" w:sz="4"/>
-            </w:tcBorders>
-            <w:tcMar>
-              <w:top w:type="dxa" w:w="70"/>
-              <w:left w:type="dxa" w:w="110"/>
-              <w:bottom w:type="dxa" w:w="70"/>
-              <w:right w:type="dxa" w:w="110"/>
-            </w:tcMar>
-          </w:tcPr>
-          <w:p>
-            <w:r>
-              <w:rPr>
-                <w:rFonts w:ascii="맑은 고딕" w:cs="맑은 고딕" w:eastAsia="맑은 고딕" w:hAnsi="맑은 고딕"/>
-                <w:b w:val="false"/>
-                <w:bCs w:val="false"/>
-                <w:sz w:val="20"/>
-                <w:szCs w:val="20"/>
-              </w:rPr>
-              <w:t xml:space="preserve">실패한 경우를 유형별로 분석하고 가상 환경(MuJoCo)에서 보강</w:t>
-            </w:r>
-          </w:p>
-        </w:tc>
-        <w:tc>
-          <w:tcPr>
-            <w:tcW w:type="dxa" w:w="2526"/>
-            <w:tcBorders>
-              <w:top w:val="single" w:color="BDB8AA" w:sz="4"/>
-              <w:left w:val="single" w:color="BDB8AA" w:sz="4"/>
-              <w:bottom w:val="single" w:color="BDB8AA" w:sz="4"/>
-              <w:right w:val="single" w:color="BDB8AA" w:sz="4"/>
-            </w:tcBorders>
-            <w:tcMar>
-              <w:top w:type="dxa" w:w="70"/>
-              <w:left w:type="dxa" w:w="110"/>
-              <w:bottom w:type="dxa" w:w="70"/>
-              <w:right w:type="dxa" w:w="110"/>
-            </w:tcMar>
-          </w:tcPr>
-          <w:p>
-            <w:r>
-              <w:rPr>
-                <w:rFonts w:ascii="맑은 고딕" w:cs="맑은 고딕" w:eastAsia="맑은 고딕" w:hAnsi="맑은 고딕"/>
-                <w:b w:val="false"/>
-                <w:bCs w:val="false"/>
-                <w:sz w:val="20"/>
-                <w:szCs w:val="20"/>
-              </w:rPr>
-              <w:t xml:space="preserve">이후</w:t>
+            <w:tcW w:type="dxa" w:w="2500"/>
+            <w:tcBorders>
+              <w:top w:val="single" w:color="BDB8AA" w:sz="4"/>
+              <w:left w:val="single" w:color="BDB8AA" w:sz="4"/>
+              <w:bottom w:val="single" w:color="BDB8AA" w:sz="4"/>
+              <w:right w:val="single" w:color="BDB8AA" w:sz="4"/>
+            </w:tcBorders>
+            <w:tcMar>
+              <w:top w:type="dxa" w:w="70"/>
+              <w:left w:type="dxa" w:w="110"/>
+              <w:bottom w:type="dxa" w:w="70"/>
+              <w:right w:type="dxa" w:w="110"/>
+            </w:tcMar>
+          </w:tcPr>
+          <w:p>
+            <w:r>
+              <w:rPr>
+                <w:rFonts w:ascii="맑은 고딕" w:cs="맑은 고딕" w:eastAsia="맑은 고딕" w:hAnsi="맑은 고딕"/>
+                <w:b w:val="false"/>
+                <w:bCs w:val="false"/>
+                <w:sz w:val="20"/>
+                <w:szCs w:val="20"/>
+              </w:rPr>
+              <w:t xml:space="preserve">운영</w:t>
+            </w:r>
+          </w:p>
+        </w:tc>
+        <w:tc>
+          <w:tcPr>
+            <w:tcW w:type="dxa" w:w="3000"/>
+            <w:tcBorders>
+              <w:top w:val="single" w:color="BDB8AA" w:sz="4"/>
+              <w:left w:val="single" w:color="BDB8AA" w:sz="4"/>
+              <w:bottom w:val="single" w:color="BDB8AA" w:sz="4"/>
+              <w:right w:val="single" w:color="BDB8AA" w:sz="4"/>
+            </w:tcBorders>
+            <w:tcMar>
+              <w:top w:type="dxa" w:w="70"/>
+              <w:left w:type="dxa" w:w="110"/>
+              <w:bottom w:type="dxa" w:w="70"/>
+              <w:right w:type="dxa" w:w="110"/>
+            </w:tcMar>
+          </w:tcPr>
+          <w:p>
+            <w:r>
+              <w:rPr>
+                <w:rFonts w:ascii="맑은 고딕" w:cs="맑은 고딕" w:eastAsia="맑은 고딕" w:hAnsi="맑은 고딕"/>
+                <w:b w:val="false"/>
+                <w:bCs w:val="false"/>
+                <w:sz w:val="20"/>
+                <w:szCs w:val="20"/>
+              </w:rPr>
+              <w:t xml:space="preserve">다른 작업과 GPU·디스크를 나눠 쓴다</w:t>
+            </w:r>
+          </w:p>
+        </w:tc>
+        <w:tc>
+          <w:tcPr>
+            <w:tcW w:type="dxa" w:w="3526"/>
+            <w:tcBorders>
+              <w:top w:val="single" w:color="BDB8AA" w:sz="4"/>
+              <w:left w:val="single" w:color="BDB8AA" w:sz="4"/>
+              <w:bottom w:val="single" w:color="BDB8AA" w:sz="4"/>
+              <w:right w:val="single" w:color="BDB8AA" w:sz="4"/>
+            </w:tcBorders>
+            <w:tcMar>
+              <w:top w:type="dxa" w:w="70"/>
+              <w:left w:type="dxa" w:w="110"/>
+              <w:bottom w:type="dxa" w:w="70"/>
+              <w:right w:type="dxa" w:w="110"/>
+            </w:tcMar>
+          </w:tcPr>
+          <w:p>
+            <w:r>
+              <w:rPr>
+                <w:rFonts w:ascii="맑은 고딕" w:cs="맑은 고딕" w:eastAsia="맑은 고딕" w:hAnsi="맑은 고딕"/>
+                <w:b w:val="false"/>
+                <w:bCs w:val="false"/>
+                <w:sz w:val="20"/>
+                <w:szCs w:val="20"/>
+              </w:rPr>
+              <w:t xml:space="preserve">GPU 여유를 확인해 시작하고, 실패하면 체크포인트에서 이어서 재시도</w:t>
             </w:r>
           </w:p>
         </w:tc>
@@ -1806,6 +2231,76 @@
           <w:szCs w:val="22"/>
         </w:rPr>
         <w:t xml:space="preserve"/>
+      </w:r>
+    </w:p>
+    <w:p>
+      <w:pPr>
+        <w:pStyle w:val="Heading1"/>
+        <w:spacing w:after="140" w:before="320"/>
+      </w:pPr>
+      <w:r>
+        <w:rPr>
+          <w:rFonts w:ascii="맑은 고딕" w:cs="맑은 고딕" w:eastAsia="맑은 고딕" w:hAnsi="맑은 고딕"/>
+          <w:b/>
+          <w:bCs/>
+          <w:sz w:val="30"/>
+          <w:szCs w:val="30"/>
+        </w:rPr>
+        <w:t xml:space="preserve">5. 평가와 다음 단계</w:t>
+      </w:r>
+    </w:p>
+    <w:p>
+      <w:pPr>
+        <w:pStyle w:val="ListParagraph"/>
+        <w:numPr>
+          <w:ilvl w:val="0"/>
+          <w:numId w:val="2"/>
+        </w:numPr>
+        <w:spacing w:after="80" w:line="300"/>
+      </w:pPr>
+      <w:r>
+        <w:rPr>
+          <w:rFonts w:ascii="맑은 고딕" w:cs="맑은 고딕" w:eastAsia="맑은 고딕" w:hAnsi="맑은 고딕"/>
+          <w:sz w:val="22"/>
+          <w:szCs w:val="22"/>
+        </w:rPr>
+        <w:t xml:space="preserve">같은 조건에서 로봇으로 30회 시험한다.</w:t>
+      </w:r>
+    </w:p>
+    <w:p>
+      <w:pPr>
+        <w:pStyle w:val="ListParagraph"/>
+        <w:numPr>
+          <w:ilvl w:val="0"/>
+          <w:numId w:val="2"/>
+        </w:numPr>
+        <w:spacing w:after="80" w:line="300"/>
+      </w:pPr>
+      <w:r>
+        <w:rPr>
+          <w:rFonts w:ascii="맑은 고딕" w:cs="맑은 고딕" w:eastAsia="맑은 고딕" w:hAnsi="맑은 고딕"/>
+          <w:sz w:val="22"/>
+          <w:szCs w:val="22"/>
+        </w:rPr>
+        <w:t xml:space="preserve">성공 기준은 시험 전에 정한다 (사람 개입 없이 끝까지 접는 것을 기본안으로 검토).</w:t>
+      </w:r>
+    </w:p>
+    <w:p>
+      <w:pPr>
+        <w:pStyle w:val="ListParagraph"/>
+        <w:numPr>
+          <w:ilvl w:val="0"/>
+          <w:numId w:val="2"/>
+        </w:numPr>
+        <w:spacing w:after="80" w:line="300"/>
+      </w:pPr>
+      <w:r>
+        <w:rPr>
+          <w:rFonts w:ascii="맑은 고딕" w:cs="맑은 고딕" w:eastAsia="맑은 고딕" w:hAnsi="맑은 고딕"/>
+          <w:sz w:val="22"/>
+          <w:szCs w:val="22"/>
+        </w:rPr>
+        <w:t xml:space="preserve">매번 성공 여부와 실패한 단계(반접기 · 전환 · 대문접기)를 기록한다.</w:t>
       </w:r>
     </w:p>
     <w:tbl>
@@ -1821,8 +2316,8 @@
         </w:tblBorders>
       </w:tblPr>
       <w:tblGrid>
-        <w:gridCol w:w="2600"/>
-        <w:gridCol w:w="6426"/>
+        <w:gridCol w:w="3000"/>
+        <w:gridCol w:w="6026"/>
       </w:tblGrid>
       <w:tr>
         <w:trPr>
@@ -1830,7 +2325,7 @@
         </w:trPr>
         <w:tc>
           <w:tcPr>
-            <w:tcW w:type="dxa" w:w="2600"/>
+            <w:tcW w:type="dxa" w:w="3000"/>
             <w:tcBorders>
               <w:top w:val="single" w:color="BDB8AA" w:sz="4"/>
               <w:left w:val="single" w:color="BDB8AA" w:sz="4"/>
@@ -1860,7 +2355,7 @@
         </w:tc>
         <w:tc>
           <w:tcPr>
-            <w:tcW w:type="dxa" w:w="6426"/>
+            <w:tcW w:type="dxa" w:w="6026"/>
             <w:tcBorders>
               <w:top w:val="single" w:color="BDB8AA" w:sz="4"/>
               <w:left w:val="single" w:color="BDB8AA" w:sz="4"/>
@@ -1892,59 +2387,59 @@
       <w:tr>
         <w:tc>
           <w:tcPr>
-            <w:tcW w:type="dxa" w:w="2600"/>
-            <w:tcBorders>
-              <w:top w:val="single" w:color="BDB8AA" w:sz="4"/>
-              <w:left w:val="single" w:color="BDB8AA" w:sz="4"/>
-              <w:bottom w:val="single" w:color="BDB8AA" w:sz="4"/>
-              <w:right w:val="single" w:color="BDB8AA" w:sz="4"/>
-            </w:tcBorders>
-            <w:tcMar>
-              <w:top w:type="dxa" w:w="70"/>
-              <w:left w:type="dxa" w:w="110"/>
-              <w:bottom w:type="dxa" w:w="70"/>
-              <w:right w:type="dxa" w:w="110"/>
-            </w:tcMar>
-          </w:tcPr>
-          <w:p>
-            <w:r>
-              <w:rPr>
-                <w:rFonts w:ascii="맑은 고딕" w:cs="맑은 고딕" w:eastAsia="맑은 고딕" w:hAnsi="맑은 고딕"/>
-                <w:b w:val="false"/>
-                <w:bCs w:val="false"/>
-                <w:sz w:val="20"/>
-                <w:szCs w:val="20"/>
-              </w:rPr>
-              <w:t xml:space="preserve">성공 기준</w:t>
-            </w:r>
-          </w:p>
-        </w:tc>
-        <w:tc>
-          <w:tcPr>
-            <w:tcW w:type="dxa" w:w="6426"/>
-            <w:tcBorders>
-              <w:top w:val="single" w:color="BDB8AA" w:sz="4"/>
-              <w:left w:val="single" w:color="BDB8AA" w:sz="4"/>
-              <w:bottom w:val="single" w:color="BDB8AA" w:sz="4"/>
-              <w:right w:val="single" w:color="BDB8AA" w:sz="4"/>
-            </w:tcBorders>
-            <w:tcMar>
-              <w:top w:type="dxa" w:w="70"/>
-              <w:left w:type="dxa" w:w="110"/>
-              <w:bottom w:type="dxa" w:w="70"/>
-              <w:right w:type="dxa" w:w="110"/>
-            </w:tcMar>
-          </w:tcPr>
-          <w:p>
-            <w:r>
-              <w:rPr>
-                <w:rFonts w:ascii="맑은 고딕" w:cs="맑은 고딕" w:eastAsia="맑은 고딕" w:hAnsi="맑은 고딕"/>
-                <w:b w:val="false"/>
-                <w:bCs w:val="false"/>
-                <w:sz w:val="20"/>
-                <w:szCs w:val="20"/>
-              </w:rPr>
-              <w:t xml:space="preserve">시험 전에 확정한다 (사람 개입 없이 끝까지 접는 것을 기본안으로 검토)</w:t>
+            <w:tcW w:type="dxa" w:w="3000"/>
+            <w:tcBorders>
+              <w:top w:val="single" w:color="BDB8AA" w:sz="4"/>
+              <w:left w:val="single" w:color="BDB8AA" w:sz="4"/>
+              <w:bottom w:val="single" w:color="BDB8AA" w:sz="4"/>
+              <w:right w:val="single" w:color="BDB8AA" w:sz="4"/>
+            </w:tcBorders>
+            <w:tcMar>
+              <w:top w:type="dxa" w:w="70"/>
+              <w:left w:type="dxa" w:w="110"/>
+              <w:bottom w:type="dxa" w:w="70"/>
+              <w:right w:type="dxa" w:w="110"/>
+            </w:tcMar>
+          </w:tcPr>
+          <w:p>
+            <w:r>
+              <w:rPr>
+                <w:rFonts w:ascii="맑은 고딕" w:cs="맑은 고딕" w:eastAsia="맑은 고딕" w:hAnsi="맑은 고딕"/>
+                <w:b w:val="false"/>
+                <w:bCs w:val="false"/>
+                <w:sz w:val="20"/>
+                <w:szCs w:val="20"/>
+              </w:rPr>
+              <w:t xml:space="preserve">반접기 중 실패</w:t>
+            </w:r>
+          </w:p>
+        </w:tc>
+        <w:tc>
+          <w:tcPr>
+            <w:tcW w:type="dxa" w:w="6026"/>
+            <w:tcBorders>
+              <w:top w:val="single" w:color="BDB8AA" w:sz="4"/>
+              <w:left w:val="single" w:color="BDB8AA" w:sz="4"/>
+              <w:bottom w:val="single" w:color="BDB8AA" w:sz="4"/>
+              <w:right w:val="single" w:color="BDB8AA" w:sz="4"/>
+            </w:tcBorders>
+            <w:tcMar>
+              <w:top w:type="dxa" w:w="70"/>
+              <w:left w:type="dxa" w:w="110"/>
+              <w:bottom w:type="dxa" w:w="70"/>
+              <w:right w:type="dxa" w:w="110"/>
+            </w:tcMar>
+          </w:tcPr>
+          <w:p>
+            <w:r>
+              <w:rPr>
+                <w:rFonts w:ascii="맑은 고딕" w:cs="맑은 고딕" w:eastAsia="맑은 고딕" w:hAnsi="맑은 고딕"/>
+                <w:b w:val="false"/>
+                <w:bCs w:val="false"/>
+                <w:sz w:val="20"/>
+                <w:szCs w:val="20"/>
+              </w:rPr>
+              <w:t xml:space="preserve">―</w:t>
             </w:r>
           </w:p>
         </w:tc>
@@ -1952,59 +2447,119 @@
       <w:tr>
         <w:tc>
           <w:tcPr>
-            <w:tcW w:type="dxa" w:w="2600"/>
-            <w:tcBorders>
-              <w:top w:val="single" w:color="BDB8AA" w:sz="4"/>
-              <w:left w:val="single" w:color="BDB8AA" w:sz="4"/>
-              <w:bottom w:val="single" w:color="BDB8AA" w:sz="4"/>
-              <w:right w:val="single" w:color="BDB8AA" w:sz="4"/>
-            </w:tcBorders>
-            <w:tcMar>
-              <w:top w:type="dxa" w:w="70"/>
-              <w:left w:type="dxa" w:w="110"/>
-              <w:bottom w:type="dxa" w:w="70"/>
-              <w:right w:type="dxa" w:w="110"/>
-            </w:tcMar>
-          </w:tcPr>
-          <w:p>
-            <w:r>
-              <w:rPr>
-                <w:rFonts w:ascii="맑은 고딕" w:cs="맑은 고딕" w:eastAsia="맑은 고딕" w:hAnsi="맑은 고딕"/>
-                <w:b w:val="false"/>
-                <w:bCs w:val="false"/>
-                <w:sz w:val="20"/>
-                <w:szCs w:val="20"/>
-              </w:rPr>
-              <w:t xml:space="preserve">결과</w:t>
-            </w:r>
-          </w:p>
-        </w:tc>
-        <w:tc>
-          <w:tcPr>
-            <w:tcW w:type="dxa" w:w="6426"/>
-            <w:tcBorders>
-              <w:top w:val="single" w:color="BDB8AA" w:sz="4"/>
-              <w:left w:val="single" w:color="BDB8AA" w:sz="4"/>
-              <w:bottom w:val="single" w:color="BDB8AA" w:sz="4"/>
-              <w:right w:val="single" w:color="BDB8AA" w:sz="4"/>
-            </w:tcBorders>
-            <w:tcMar>
-              <w:top w:type="dxa" w:w="70"/>
-              <w:left w:type="dxa" w:w="110"/>
-              <w:bottom w:type="dxa" w:w="70"/>
-              <w:right w:type="dxa" w:w="110"/>
-            </w:tcMar>
-          </w:tcPr>
-          <w:p>
-            <w:r>
-              <w:rPr>
-                <w:rFonts w:ascii="맑은 고딕" w:cs="맑은 고딕" w:eastAsia="맑은 고딕" w:hAnsi="맑은 고딕"/>
-                <w:b w:val="false"/>
-                <w:bCs w:val="false"/>
-                <w:sz w:val="20"/>
-                <w:szCs w:val="20"/>
-              </w:rPr>
-              <w:t xml:space="preserve">시험이 끝나면 이 표에 채운다</w:t>
+            <w:tcW w:type="dxa" w:w="3000"/>
+            <w:tcBorders>
+              <w:top w:val="single" w:color="BDB8AA" w:sz="4"/>
+              <w:left w:val="single" w:color="BDB8AA" w:sz="4"/>
+              <w:bottom w:val="single" w:color="BDB8AA" w:sz="4"/>
+              <w:right w:val="single" w:color="BDB8AA" w:sz="4"/>
+            </w:tcBorders>
+            <w:tcMar>
+              <w:top w:type="dxa" w:w="70"/>
+              <w:left w:type="dxa" w:w="110"/>
+              <w:bottom w:type="dxa" w:w="70"/>
+              <w:right w:type="dxa" w:w="110"/>
+            </w:tcMar>
+          </w:tcPr>
+          <w:p>
+            <w:r>
+              <w:rPr>
+                <w:rFonts w:ascii="맑은 고딕" w:cs="맑은 고딕" w:eastAsia="맑은 고딕" w:hAnsi="맑은 고딕"/>
+                <w:b w:val="false"/>
+                <w:bCs w:val="false"/>
+                <w:sz w:val="20"/>
+                <w:szCs w:val="20"/>
+              </w:rPr>
+              <w:t xml:space="preserve">전환 구간 실패</w:t>
+            </w:r>
+          </w:p>
+        </w:tc>
+        <w:tc>
+          <w:tcPr>
+            <w:tcW w:type="dxa" w:w="6026"/>
+            <w:tcBorders>
+              <w:top w:val="single" w:color="BDB8AA" w:sz="4"/>
+              <w:left w:val="single" w:color="BDB8AA" w:sz="4"/>
+              <w:bottom w:val="single" w:color="BDB8AA" w:sz="4"/>
+              <w:right w:val="single" w:color="BDB8AA" w:sz="4"/>
+            </w:tcBorders>
+            <w:tcMar>
+              <w:top w:type="dxa" w:w="70"/>
+              <w:left w:type="dxa" w:w="110"/>
+              <w:bottom w:type="dxa" w:w="70"/>
+              <w:right w:type="dxa" w:w="110"/>
+            </w:tcMar>
+          </w:tcPr>
+          <w:p>
+            <w:r>
+              <w:rPr>
+                <w:rFonts w:ascii="맑은 고딕" w:cs="맑은 고딕" w:eastAsia="맑은 고딕" w:hAnsi="맑은 고딕"/>
+                <w:b w:val="false"/>
+                <w:bCs w:val="false"/>
+                <w:sz w:val="20"/>
+                <w:szCs w:val="20"/>
+              </w:rPr>
+              <w:t xml:space="preserve">―</w:t>
+            </w:r>
+          </w:p>
+        </w:tc>
+      </w:tr>
+      <w:tr>
+        <w:tc>
+          <w:tcPr>
+            <w:tcW w:type="dxa" w:w="3000"/>
+            <w:tcBorders>
+              <w:top w:val="single" w:color="BDB8AA" w:sz="4"/>
+              <w:left w:val="single" w:color="BDB8AA" w:sz="4"/>
+              <w:bottom w:val="single" w:color="BDB8AA" w:sz="4"/>
+              <w:right w:val="single" w:color="BDB8AA" w:sz="4"/>
+            </w:tcBorders>
+            <w:tcMar>
+              <w:top w:type="dxa" w:w="70"/>
+              <w:left w:type="dxa" w:w="110"/>
+              <w:bottom w:type="dxa" w:w="70"/>
+              <w:right w:type="dxa" w:w="110"/>
+            </w:tcMar>
+          </w:tcPr>
+          <w:p>
+            <w:r>
+              <w:rPr>
+                <w:rFonts w:ascii="맑은 고딕" w:cs="맑은 고딕" w:eastAsia="맑은 고딕" w:hAnsi="맑은 고딕"/>
+                <w:b w:val="false"/>
+                <w:bCs w:val="false"/>
+                <w:sz w:val="20"/>
+                <w:szCs w:val="20"/>
+              </w:rPr>
+              <w:t xml:space="preserve">대문접기 중 실패</w:t>
+            </w:r>
+          </w:p>
+        </w:tc>
+        <w:tc>
+          <w:tcPr>
+            <w:tcW w:type="dxa" w:w="6026"/>
+            <w:tcBorders>
+              <w:top w:val="single" w:color="BDB8AA" w:sz="4"/>
+              <w:left w:val="single" w:color="BDB8AA" w:sz="4"/>
+              <w:bottom w:val="single" w:color="BDB8AA" w:sz="4"/>
+              <w:right w:val="single" w:color="BDB8AA" w:sz="4"/>
+            </w:tcBorders>
+            <w:tcMar>
+              <w:top w:type="dxa" w:w="70"/>
+              <w:left w:type="dxa" w:w="110"/>
+              <w:bottom w:type="dxa" w:w="70"/>
+              <w:right w:type="dxa" w:w="110"/>
+            </w:tcMar>
+          </w:tcPr>
+          <w:p>
+            <w:r>
+              <w:rPr>
+                <w:rFonts w:ascii="맑은 고딕" w:cs="맑은 고딕" w:eastAsia="맑은 고딕" w:hAnsi="맑은 고딕"/>
+                <w:b w:val="false"/>
+                <w:bCs w:val="false"/>
+                <w:sz w:val="20"/>
+                <w:szCs w:val="20"/>
+              </w:rPr>
+              <w:t xml:space="preserve">―</w:t>
             </w:r>
           </w:p>
         </w:tc>
@@ -2040,7 +2595,7 @@
           <w:sz w:val="22"/>
           <w:szCs w:val="22"/>
         </w:rPr>
-        <w:t xml:space="preserve">왜 실제 시험이 필요한가: </w:t>
+        <w:t xml:space="preserve">다음 단계: </w:t>
       </w:r>
       <w:r>
         <w:rPr>
@@ -2048,361 +2603,7 @@
           <w:sz w:val="22"/>
           <w:szCs w:val="22"/>
         </w:rPr>
-        <w:t xml:space="preserve">학습 중 오차가 줄어도 로봇이 실제로 잘 접는다는 보장은 없다. 30회 시험이 이 설계가 맞았는지 알려주는 유일한 최종 검증이다.</w:t>
-      </w:r>
-    </w:p>
-    <w:p>
-      <w:pPr>
-        <w:pStyle w:val="Heading1"/>
-        <w:spacing w:after="140" w:before="320"/>
-      </w:pPr>
-      <w:r>
-        <w:rPr>
-          <w:rFonts w:ascii="맑은 고딕" w:cs="맑은 고딕" w:eastAsia="맑은 고딕" w:hAnsi="맑은 고딕"/>
-          <w:b/>
-          <w:bCs/>
-          <w:sz w:val="30"/>
-          <w:szCs w:val="30"/>
-        </w:rPr>
-        <w:t xml:space="preserve">6. 알려진 위험과 대응</w:t>
-      </w:r>
-    </w:p>
-    <w:tbl>
-      <w:tblPr>
-        <w:tblW w:type="dxa" w:w="9026"/>
-        <w:tblBorders>
-          <w:top w:val="single" w:color="auto" w:sz="4"/>
-          <w:left w:val="single" w:color="auto" w:sz="4"/>
-          <w:bottom w:val="single" w:color="auto" w:sz="4"/>
-          <w:right w:val="single" w:color="auto" w:sz="4"/>
-          <w:insideH w:val="single" w:color="auto" w:sz="4"/>
-          <w:insideV w:val="single" w:color="auto" w:sz="4"/>
-        </w:tblBorders>
-      </w:tblPr>
-      <w:tblGrid>
-        <w:gridCol w:w="2900"/>
-        <w:gridCol w:w="6126"/>
-      </w:tblGrid>
-      <w:tr>
-        <w:trPr>
-          <w:tblHeader/>
-        </w:trPr>
-        <w:tc>
-          <w:tcPr>
-            <w:tcW w:type="dxa" w:w="2900"/>
-            <w:tcBorders>
-              <w:top w:val="single" w:color="BDB8AA" w:sz="4"/>
-              <w:left w:val="single" w:color="BDB8AA" w:sz="4"/>
-              <w:bottom w:val="single" w:color="BDB8AA" w:sz="4"/>
-              <w:right w:val="single" w:color="BDB8AA" w:sz="4"/>
-            </w:tcBorders>
-            <w:shd w:fill="ECE9E0" w:color="auto" w:val="clear"/>
-            <w:tcMar>
-              <w:top w:type="dxa" w:w="70"/>
-              <w:left w:type="dxa" w:w="110"/>
-              <w:bottom w:type="dxa" w:w="70"/>
-              <w:right w:type="dxa" w:w="110"/>
-            </w:tcMar>
-          </w:tcPr>
-          <w:p>
-            <w:r>
-              <w:rPr>
-                <w:rFonts w:ascii="맑은 고딕" w:cs="맑은 고딕" w:eastAsia="맑은 고딕" w:hAnsi="맑은 고딕"/>
-                <w:b/>
-                <w:bCs/>
-                <w:sz w:val="20"/>
-                <w:szCs w:val="20"/>
-              </w:rPr>
-              <w:t xml:space="preserve">위험</w:t>
-            </w:r>
-          </w:p>
-        </w:tc>
-        <w:tc>
-          <w:tcPr>
-            <w:tcW w:type="dxa" w:w="6126"/>
-            <w:tcBorders>
-              <w:top w:val="single" w:color="BDB8AA" w:sz="4"/>
-              <w:left w:val="single" w:color="BDB8AA" w:sz="4"/>
-              <w:bottom w:val="single" w:color="BDB8AA" w:sz="4"/>
-              <w:right w:val="single" w:color="BDB8AA" w:sz="4"/>
-            </w:tcBorders>
-            <w:shd w:fill="ECE9E0" w:color="auto" w:val="clear"/>
-            <w:tcMar>
-              <w:top w:type="dxa" w:w="70"/>
-              <w:left w:type="dxa" w:w="110"/>
-              <w:bottom w:type="dxa" w:w="70"/>
-              <w:right w:type="dxa" w:w="110"/>
-            </w:tcMar>
-          </w:tcPr>
-          <w:p>
-            <w:r>
-              <w:rPr>
-                <w:rFonts w:ascii="맑은 고딕" w:cs="맑은 고딕" w:eastAsia="맑은 고딕" w:hAnsi="맑은 고딕"/>
-                <w:b/>
-                <w:bCs/>
-                <w:sz w:val="20"/>
-                <w:szCs w:val="20"/>
-              </w:rPr>
-              <w:t xml:space="preserve">대응</w:t>
-            </w:r>
-          </w:p>
-        </w:tc>
-      </w:tr>
-      <w:tr>
-        <w:tc>
-          <w:tcPr>
-            <w:tcW w:type="dxa" w:w="2900"/>
-            <w:tcBorders>
-              <w:top w:val="single" w:color="BDB8AA" w:sz="4"/>
-              <w:left w:val="single" w:color="BDB8AA" w:sz="4"/>
-              <w:bottom w:val="single" w:color="BDB8AA" w:sz="4"/>
-              <w:right w:val="single" w:color="BDB8AA" w:sz="4"/>
-            </w:tcBorders>
-            <w:tcMar>
-              <w:top w:type="dxa" w:w="70"/>
-              <w:left w:type="dxa" w:w="110"/>
-              <w:bottom w:type="dxa" w:w="70"/>
-              <w:right w:type="dxa" w:w="110"/>
-            </w:tcMar>
-          </w:tcPr>
-          <w:p>
-            <w:r>
-              <w:rPr>
-                <w:rFonts w:ascii="맑은 고딕" w:cs="맑은 고딕" w:eastAsia="맑은 고딕" w:hAnsi="맑은 고딕"/>
-                <w:b w:val="false"/>
-                <w:bCs w:val="false"/>
-                <w:sz w:val="20"/>
-                <w:szCs w:val="20"/>
-              </w:rPr>
-              <w:t xml:space="preserve">학습량 부족 (데이터를 약 1.2바퀴)</w:t>
-            </w:r>
-          </w:p>
-        </w:tc>
-        <w:tc>
-          <w:tcPr>
-            <w:tcW w:type="dxa" w:w="6126"/>
-            <w:tcBorders>
-              <w:top w:val="single" w:color="BDB8AA" w:sz="4"/>
-              <w:left w:val="single" w:color="BDB8AA" w:sz="4"/>
-              <w:bottom w:val="single" w:color="BDB8AA" w:sz="4"/>
-              <w:right w:val="single" w:color="BDB8AA" w:sz="4"/>
-            </w:tcBorders>
-            <w:tcMar>
-              <w:top w:type="dxa" w:w="70"/>
-              <w:left w:type="dxa" w:w="110"/>
-              <w:bottom w:type="dxa" w:w="70"/>
-              <w:right w:type="dxa" w:w="110"/>
-            </w:tcMar>
-          </w:tcPr>
-          <w:p>
-            <w:r>
-              <w:rPr>
-                <w:rFonts w:ascii="맑은 고딕" w:cs="맑은 고딕" w:eastAsia="맑은 고딕" w:hAnsi="맑은 고딕"/>
-                <w:b w:val="false"/>
-                <w:bCs w:val="false"/>
-                <w:sz w:val="20"/>
-                <w:szCs w:val="20"/>
-              </w:rPr>
-              <w:t xml:space="preserve">결과에 따라 학습을 더 이어서 진행</w:t>
-            </w:r>
-          </w:p>
-        </w:tc>
-      </w:tr>
-      <w:tr>
-        <w:tc>
-          <w:tcPr>
-            <w:tcW w:type="dxa" w:w="2900"/>
-            <w:tcBorders>
-              <w:top w:val="single" w:color="BDB8AA" w:sz="4"/>
-              <w:left w:val="single" w:color="BDB8AA" w:sz="4"/>
-              <w:bottom w:val="single" w:color="BDB8AA" w:sz="4"/>
-              <w:right w:val="single" w:color="BDB8AA" w:sz="4"/>
-            </w:tcBorders>
-            <w:tcMar>
-              <w:top w:type="dxa" w:w="70"/>
-              <w:left w:type="dxa" w:w="110"/>
-              <w:bottom w:type="dxa" w:w="70"/>
-              <w:right w:type="dxa" w:w="110"/>
-            </w:tcMar>
-          </w:tcPr>
-          <w:p>
-            <w:r>
-              <w:rPr>
-                <w:rFonts w:ascii="맑은 고딕" w:cs="맑은 고딕" w:eastAsia="맑은 고딕" w:hAnsi="맑은 고딕"/>
-                <w:b w:val="false"/>
-                <w:bCs w:val="false"/>
-                <w:sz w:val="20"/>
-                <w:szCs w:val="20"/>
-              </w:rPr>
-              <w:t xml:space="preserve">과적합 (같은 데이터를 오래 학습)</w:t>
-            </w:r>
-          </w:p>
-        </w:tc>
-        <w:tc>
-          <w:tcPr>
-            <w:tcW w:type="dxa" w:w="6126"/>
-            <w:tcBorders>
-              <w:top w:val="single" w:color="BDB8AA" w:sz="4"/>
-              <w:left w:val="single" w:color="BDB8AA" w:sz="4"/>
-              <w:bottom w:val="single" w:color="BDB8AA" w:sz="4"/>
-              <w:right w:val="single" w:color="BDB8AA" w:sz="4"/>
-            </w:tcBorders>
-            <w:tcMar>
-              <w:top w:type="dxa" w:w="70"/>
-              <w:left w:type="dxa" w:w="110"/>
-              <w:bottom w:type="dxa" w:w="70"/>
-              <w:right w:type="dxa" w:w="110"/>
-            </w:tcMar>
-          </w:tcPr>
-          <w:p>
-            <w:r>
-              <w:rPr>
-                <w:rFonts w:ascii="맑은 고딕" w:cs="맑은 고딕" w:eastAsia="맑은 고딕" w:hAnsi="맑은 고딕"/>
-                <w:b w:val="false"/>
-                <w:bCs w:val="false"/>
-                <w:sz w:val="20"/>
-                <w:szCs w:val="20"/>
-              </w:rPr>
-              <w:t xml:space="preserve">평가 손실을 보고 이전 체크포인트 사용</w:t>
-            </w:r>
-          </w:p>
-        </w:tc>
-      </w:tr>
-      <w:tr>
-        <w:tc>
-          <w:tcPr>
-            <w:tcW w:type="dxa" w:w="2900"/>
-            <w:tcBorders>
-              <w:top w:val="single" w:color="BDB8AA" w:sz="4"/>
-              <w:left w:val="single" w:color="BDB8AA" w:sz="4"/>
-              <w:bottom w:val="single" w:color="BDB8AA" w:sz="4"/>
-              <w:right w:val="single" w:color="BDB8AA" w:sz="4"/>
-            </w:tcBorders>
-            <w:tcMar>
-              <w:top w:type="dxa" w:w="70"/>
-              <w:left w:type="dxa" w:w="110"/>
-              <w:bottom w:type="dxa" w:w="70"/>
-              <w:right w:type="dxa" w:w="110"/>
-            </w:tcMar>
-          </w:tcPr>
-          <w:p>
-            <w:r>
-              <w:rPr>
-                <w:rFonts w:ascii="맑은 고딕" w:cs="맑은 고딕" w:eastAsia="맑은 고딕" w:hAnsi="맑은 고딕"/>
-                <w:b w:val="false"/>
-                <w:bCs w:val="false"/>
-                <w:sz w:val="20"/>
-                <w:szCs w:val="20"/>
-              </w:rPr>
-              <w:t xml:space="preserve">손실값과 실제 성공의 불일치</w:t>
-            </w:r>
-          </w:p>
-        </w:tc>
-        <w:tc>
-          <w:tcPr>
-            <w:tcW w:type="dxa" w:w="6126"/>
-            <w:tcBorders>
-              <w:top w:val="single" w:color="BDB8AA" w:sz="4"/>
-              <w:left w:val="single" w:color="BDB8AA" w:sz="4"/>
-              <w:bottom w:val="single" w:color="BDB8AA" w:sz="4"/>
-              <w:right w:val="single" w:color="BDB8AA" w:sz="4"/>
-            </w:tcBorders>
-            <w:tcMar>
-              <w:top w:type="dxa" w:w="70"/>
-              <w:left w:type="dxa" w:w="110"/>
-              <w:bottom w:type="dxa" w:w="70"/>
-              <w:right w:type="dxa" w:w="110"/>
-            </w:tcMar>
-          </w:tcPr>
-          <w:p>
-            <w:r>
-              <w:rPr>
-                <w:rFonts w:ascii="맑은 고딕" w:cs="맑은 고딕" w:eastAsia="맑은 고딕" w:hAnsi="맑은 고딕"/>
-                <w:b w:val="false"/>
-                <w:bCs w:val="false"/>
-                <w:sz w:val="20"/>
-                <w:szCs w:val="20"/>
-              </w:rPr>
-              <w:t xml:space="preserve">30회 실제 시험으로 성공률 확인</w:t>
-            </w:r>
-          </w:p>
-        </w:tc>
-      </w:tr>
-      <w:tr>
-        <w:tc>
-          <w:tcPr>
-            <w:tcW w:type="dxa" w:w="2900"/>
-            <w:tcBorders>
-              <w:top w:val="single" w:color="BDB8AA" w:sz="4"/>
-              <w:left w:val="single" w:color="BDB8AA" w:sz="4"/>
-              <w:bottom w:val="single" w:color="BDB8AA" w:sz="4"/>
-              <w:right w:val="single" w:color="BDB8AA" w:sz="4"/>
-            </w:tcBorders>
-            <w:tcMar>
-              <w:top w:type="dxa" w:w="70"/>
-              <w:left w:type="dxa" w:w="110"/>
-              <w:bottom w:type="dxa" w:w="70"/>
-              <w:right w:type="dxa" w:w="110"/>
-            </w:tcMar>
-          </w:tcPr>
-          <w:p>
-            <w:r>
-              <w:rPr>
-                <w:rFonts w:ascii="맑은 고딕" w:cs="맑은 고딕" w:eastAsia="맑은 고딕" w:hAnsi="맑은 고딕"/>
-                <w:b w:val="false"/>
-                <w:bCs w:val="false"/>
-                <w:sz w:val="20"/>
-                <w:szCs w:val="20"/>
-              </w:rPr>
-              <w:t xml:space="preserve">디스크 여유가 20GB대</w:t>
-            </w:r>
-          </w:p>
-        </w:tc>
-        <w:tc>
-          <w:tcPr>
-            <w:tcW w:type="dxa" w:w="6126"/>
-            <w:tcBorders>
-              <w:top w:val="single" w:color="BDB8AA" w:sz="4"/>
-              <w:left w:val="single" w:color="BDB8AA" w:sz="4"/>
-              <w:bottom w:val="single" w:color="BDB8AA" w:sz="4"/>
-              <w:right w:val="single" w:color="BDB8AA" w:sz="4"/>
-            </w:tcBorders>
-            <w:tcMar>
-              <w:top w:type="dxa" w:w="70"/>
-              <w:left w:type="dxa" w:w="110"/>
-              <w:bottom w:type="dxa" w:w="70"/>
-              <w:right w:type="dxa" w:w="110"/>
-            </w:tcMar>
-          </w:tcPr>
-          <w:p>
-            <w:r>
-              <w:rPr>
-                <w:rFonts w:ascii="맑은 고딕" w:cs="맑은 고딕" w:eastAsia="맑은 고딕" w:hAnsi="맑은 고딕"/>
-                <w:b w:val="false"/>
-                <w:bCs w:val="false"/>
-                <w:sz w:val="20"/>
-                <w:szCs w:val="20"/>
-              </w:rPr>
-              <w:t xml:space="preserve">다른 작업의 대용량 쓰기가 있으면 절단·학습이 멈출 수 있어 진행 상황을 감시</w:t>
-            </w:r>
-          </w:p>
-        </w:tc>
-      </w:tr>
-    </w:tbl>
-    <w:p>
-      <w:pPr>
-        <w:pStyle w:val="Heading1"/>
-        <w:spacing w:after="140" w:before="320"/>
-      </w:pPr>
-      <w:r>
-        <w:rPr>
-          <w:rFonts w:ascii="맑은 고딕" w:cs="맑은 고딕" w:eastAsia="맑은 고딕" w:hAnsi="맑은 고딕"/>
-          <w:b/>
-          <w:bCs/>
-          <w:sz w:val="30"/>
-          <w:szCs w:val="30"/>
-        </w:rPr>
-        <w:t xml:space="preserve">7. 확인 방법</w:t>
+        <w:t xml:space="preserve">실패가 전환이나 대문접기에 몰리면 정책을 둘로 나눠 학습한다. 시연 추가와 가상 환경(MuJoCo) 보강도 함께 검토한다.</w:t>
       </w:r>
     </w:p>
     <w:p>
@@ -2417,10 +2618,36 @@
       <w:r>
         <w:rPr>
           <w:rFonts w:ascii="맑은 고딕" w:cs="맑은 고딕" w:eastAsia="맑은 고딕" w:hAnsi="맑은 고딕"/>
+          <w:b/>
+          <w:bCs/>
           <w:sz w:val="22"/>
           <w:szCs w:val="22"/>
         </w:rPr>
-        <w:t xml:space="preserve">데이터 정리 진행: outputs/train/cut_half_to_gate_fold.log 의 [N/97].</w:t>
+        <w:t xml:space="preserve">정직한 한계: </w:t>
+      </w:r>
+      <w:r>
+        <w:rPr>
+          <w:rFonts w:ascii="맑은 고딕" w:cs="맑은 고딕" w:eastAsia="맑은 고딕" w:hAnsi="맑은 고딕"/>
+          <w:sz w:val="22"/>
+          <w:szCs w:val="22"/>
+        </w:rPr>
+        <w:t xml:space="preserve">실제 로봇 성공률은 아직 없다. 손실값만으로 성공을 판단할 수 없고, 정책을 나누는 것이 더 나은지도 실험 전에는 알 수 없다.</w:t>
+      </w:r>
+    </w:p>
+    <w:p>
+      <w:pPr>
+        <w:pStyle w:val="Heading1"/>
+        <w:spacing w:after="140" w:before="320"/>
+      </w:pPr>
+      <w:r>
+        <w:rPr>
+          <w:rFonts w:ascii="맑은 고딕" w:cs="맑은 고딕" w:eastAsia="맑은 고딕" w:hAnsi="맑은 고딕"/>
+          <w:b/>
+          <w:bCs/>
+          <w:sz w:val="30"/>
+          <w:szCs w:val="30"/>
+        </w:rPr>
+        <w:t xml:space="preserve">확인 방법</w:t>
       </w:r>
     </w:p>
     <w:p>
@@ -2438,7 +2665,7 @@
           <w:sz w:val="22"/>
           <w:szCs w:val="22"/>
         </w:rPr>
-        <w:t xml:space="preserve">전체 진행: outputs/train/half_to_gate_chain.log 의 CUT_DONE, START, TRAIN_DONE.</w:t>
+        <w:t xml:space="preserve">데이터 정리 진행: outputs/train/cut_half_to_gate_fold.log 의 [N/97].</w:t>
       </w:r>
     </w:p>
     <w:p>
@@ -2456,7 +2683,7 @@
           <w:sz w:val="22"/>
           <w:szCs w:val="22"/>
         </w:rPr>
-        <w:t xml:space="preserve">학습 상태: outputs/train/act_half_to_gate_fold_v1.log 의 step 과 loss.</w:t>
+        <w:t xml:space="preserve">전체 진행: outputs/train/half_to_gate_chain.log 의 CUT_DONE, WAIT_GPU, START, TRAIN_DONE.</w:t>
       </w:r>
     </w:p>
     <w:p>
@@ -2474,7 +2701,25 @@
           <w:sz w:val="22"/>
           <w:szCs w:val="22"/>
         </w:rPr>
-        <w:t xml:space="preserve">발표 자료: docs/towel_report/v2/slides.html(브라우저), slides.pdf, slides.pptx(편집 가능).</w:t>
+        <w:t xml:space="preserve">학습 상태: outputs/train/act_half_to_gate_fold_v1.log 의 step 과 loss.</w:t>
+      </w:r>
+    </w:p>
+    <w:p>
+      <w:pPr>
+        <w:pStyle w:val="ListParagraph"/>
+        <w:numPr>
+          <w:ilvl w:val="0"/>
+          <w:numId w:val="2"/>
+        </w:numPr>
+        <w:spacing w:after="80" w:line="300"/>
+      </w:pPr>
+      <w:r>
+        <w:rPr>
+          <w:rFonts w:ascii="맑은 고딕" w:cs="맑은 고딕" w:eastAsia="맑은 고딕" w:hAnsi="맑은 고딕"/>
+          <w:sz w:val="22"/>
+          <w:szCs w:val="22"/>
+        </w:rPr>
+        <w:t xml:space="preserve">발표 자료(5장): docs/towel_report/v2/slides.html(브라우저), slides.pdf, slides.pptx(편집 가능).</w:t>
       </w:r>
     </w:p>
     <w:sectPr>

</xml_diff>